<commit_message>
Recover real plot codes/names from DWG labels; fix DXF export scale to true metres
</commit_message>
<xml_diff>
--- a/LFZ-Project-Documentation.docx
+++ b/LFZ-Project-Documentation.docx
@@ -1416,7 +1416,7 @@
           <w:spacing w:val="0"/>
           <w:color w:val="181E2A"/>
         </w:rPr>
-        <w:t xml:space="preserve">dotnet run -- ../../masterplan.dxf --extent-max-x 112667000</w:t>
+        <w:t xml:space="preserve">dotnet run -- ../../masterplan.dxf --extent-wkt phase1a-extent.wkt</w:t>
       </w:r>
     </w:p>
     <w:p>
@@ -1442,7 +1442,33 @@
           <w:spacing w:val="0"/>
           <w:color w:val="181E2A"/>
         </w:rPr>
-        <w:t xml:space="preserve">python3 ../build_prototype.py    # refresh LFZ-prototype.html</w:t>
+        <w:t xml:space="preserve">python3 ../extract_plot_labels.py    # real plot codes/names + true-metre scale</w:t>
+      </w:r>
+    </w:p>
+    <w:p>
+      <w:pPr/>
+      <w:r>
+        <w:rPr>
+          <w:rFonts w:ascii="Menlo" w:hAnsi="Menlo" w:cs="Menlo"/>
+          <w:sz w:val="25"/>
+          <w:sz-cs w:val="25"/>
+          <w:spacing w:val="0"/>
+          <w:color w:val="181E2A"/>
+        </w:rPr>
+        <w:t xml:space="preserve">python3 ../extract_hatch_colors.py   # land-use hatch colours from the DWG legend</w:t>
+      </w:r>
+    </w:p>
+    <w:p>
+      <w:pPr/>
+      <w:r>
+        <w:rPr>
+          <w:rFonts w:ascii="Menlo" w:hAnsi="Menlo" w:cs="Menlo"/>
+          <w:sz w:val="25"/>
+          <w:sz-cs w:val="25"/>
+          <w:spacing w:val="0"/>
+          <w:color w:val="181E2A"/>
+        </w:rPr>
+        <w:t xml:space="preserve">python3 ../build_prototype.py        # refresh LFZ-prototype.html</w:t>
       </w:r>
     </w:p>
     <w:p>
@@ -6362,27 +6388,47 @@
           <w:spacing w:val="0"/>
           <w:color w:val="181E2A"/>
         </w:rPr>
-        <w:t xml:space="preserve"> The drawing covers more than Phase 1A. The DWG contains no Phase 1A boundary layer, so the extent is approximated by a centroid cut-off </w:t>
-      </w:r>
-      <w:r>
-        <w:rPr>
-          <w:rFonts w:ascii="Menlo" w:hAnsi="Menlo" w:cs="Menlo"/>
-          <w:sz w:val="25"/>
-          <w:sz-cs w:val="25"/>
-          <w:spacing w:val="0"/>
-          <w:color w:val="181E2A"/>
-        </w:rPr>
-        <w:t xml:space="preserve">--extent-max-x 112667000</w:t>
-      </w:r>
-      <w:r>
-        <w:rPr>
-          <w:rFonts w:ascii="Helvetica Neue" w:hAnsi="Helvetica Neue" w:cs="Helvetica Neue"/>
-          <w:sz w:val="29"/>
-          <w:sz-cs w:val="29"/>
-          <w:spacing w:val="0"/>
-          <w:color w:val="181E2A"/>
-        </w:rPr>
-        <w:t xml:space="preserve"> (raw units). Supply the real phase polygon to make this exact.</w:t>
+        <w:t xml:space="preserve"> The drawing covers more than Phase 1A and contains no phase-boundary layer (verified against every layer in the drawing — the only boundary-named layers are the small “00 Port Boundary” sub-area and a legend rectangle). The extent is therefore supplied as a WKT polygon (</w:t>
+      </w:r>
+      <w:r>
+        <w:rPr>
+          <w:rFonts w:ascii="Menlo" w:hAnsi="Menlo" w:cs="Menlo"/>
+          <w:sz w:val="25"/>
+          <w:sz-cs w:val="25"/>
+          <w:spacing w:val="0"/>
+          <w:color w:val="181E2A"/>
+        </w:rPr>
+        <w:t xml:space="preserve">--extent-wkt phase1a-extent.wkt</w:t>
+      </w:r>
+      <w:r>
+        <w:rPr>
+          <w:rFonts w:ascii="Helvetica Neue" w:hAnsi="Helvetica Neue" w:cs="Helvetica Neue"/>
+          <w:sz w:val="29"/>
+          <w:sz-cs w:val="29"/>
+          <w:spacing w:val="0"/>
+          <w:color w:val="181E2A"/>
+        </w:rPr>
+        <w:t xml:space="preserve">): a calibrated concave envelope of the verified Phase 1A parcel set (4 parts, 10 m margin) that reproduces the parcel set exactly and deterministically. If an official phase-boundary polygon becomes available, drop its WKT into the same file — no code change. (A legacy </w:t>
+      </w:r>
+      <w:r>
+        <w:rPr>
+          <w:rFonts w:ascii="Menlo" w:hAnsi="Menlo" w:cs="Menlo"/>
+          <w:sz w:val="25"/>
+          <w:sz-cs w:val="25"/>
+          <w:spacing w:val="0"/>
+          <w:color w:val="181E2A"/>
+        </w:rPr>
+        <w:t xml:space="preserve">--extent-max-x</w:t>
+      </w:r>
+      <w:r>
+        <w:rPr>
+          <w:rFonts w:ascii="Helvetica Neue" w:hAnsi="Helvetica Neue" w:cs="Helvetica Neue"/>
+          <w:sz w:val="29"/>
+          <w:sz-cs w:val="29"/>
+          <w:spacing w:val="0"/>
+          <w:color w:val="181E2A"/>
+        </w:rPr>
+        <w:t xml:space="preserve"> centroid cut-off remains as a fallback.)</w:t>
       </w:r>
     </w:p>
     <w:p>
@@ -6489,6 +6535,7 @@
     <w:p>
       <w:pPr>
         <w:ind w:left="720" w:first-line="-720"/>
+        <w:spacing w:after="293"/>
       </w:pPr>
       <w:r>
         <w:rPr>
@@ -6523,27 +6570,107 @@
           <w:spacing w:val="0"/>
           <w:color w:val="181E2A"/>
         </w:rPr>
-        <w:t xml:space="preserve"> Parcels are ranked by area. The largest receive stable codes/names seeded from the PDF legend (</w:t>
-      </w:r>
-      <w:r>
-        <w:rPr>
-          <w:rFonts w:ascii="Menlo" w:hAnsi="Menlo" w:cs="Menlo"/>
-          <w:sz w:val="25"/>
-          <w:sz-cs w:val="25"/>
-          <w:spacing w:val="0"/>
-          <w:color w:val="181E2A"/>
-        </w:rPr>
-        <w:t xml:space="preserve">tools/LFZ.Tools.PlotExtractor/seed-codes.json</w:t>
-      </w:r>
-      <w:r>
-        <w:rPr>
-          <w:rFonts w:ascii="Helvetica Neue" w:hAnsi="Helvetica Neue" w:cs="Helvetica Neue"/>
-          <w:sz w:val="29"/>
-          <w:sz-cs w:val="29"/>
-          <w:spacing w:val="0"/>
-          <w:color w:val="181E2A"/>
-        </w:rPr>
-        <w:t xml:space="preserve">); the rest receive synthesised </w:t>
+        <w:t xml:space="preserve"> Plot codes and names are recovered from the DWG itself by </w:t>
+      </w:r>
+      <w:r>
+        <w:rPr>
+          <w:rFonts w:ascii="Menlo" w:hAnsi="Menlo" w:cs="Menlo"/>
+          <w:sz w:val="25"/>
+          <w:sz-cs w:val="25"/>
+          <w:spacing w:val="0"/>
+          <w:color w:val="181E2A"/>
+        </w:rPr>
+        <w:t xml:space="preserve">tools/extract_plot_labels.py</w:t>
+      </w:r>
+      <w:r>
+        <w:rPr>
+          <w:rFonts w:ascii="Helvetica Neue" w:hAnsi="Helvetica Neue" w:cs="Helvetica Neue"/>
+          <w:sz w:val="29"/>
+          <w:sz-cs w:val="29"/>
+          <w:spacing w:val="0"/>
+          <w:color w:val="181E2A"/>
+        </w:rPr>
+        <w:t xml:space="preserve">: the DWG model space carries the true-scale </w:t>
+      </w:r>
+      <w:r>
+        <w:rPr>
+          <w:rFonts w:ascii="Menlo" w:hAnsi="Menlo" w:cs="Menlo"/>
+          <w:sz w:val="25"/>
+          <w:sz-cs w:val="25"/>
+          <w:spacing w:val="0"/>
+          <w:color w:val="181E2A"/>
+        </w:rPr>
+        <w:t xml:space="preserve">PLOT AREA</w:t>
+      </w:r>
+      <w:r>
+        <w:rPr>
+          <w:rFonts w:ascii="Helvetica Neue" w:hAnsi="Helvetica Neue" w:cs="Helvetica Neue"/>
+          <w:sz w:val="29"/>
+          <w:sz-cs w:val="29"/>
+          <w:spacing w:val="0"/>
+          <w:color w:val="181E2A"/>
+        </w:rPr>
+        <w:t xml:space="preserve"> rings and the plot ID labels (MTEXT/TEXT such as </w:t>
+      </w:r>
+      <w:r>
+        <w:rPr>
+          <w:rFonts w:ascii="Menlo" w:hAnsi="Menlo" w:cs="Menlo"/>
+          <w:sz w:val="25"/>
+          <w:sz-cs w:val="25"/>
+          <w:spacing w:val="0"/>
+          <w:color w:val="181E2A"/>
+        </w:rPr>
+        <w:t xml:space="preserve">I 004 / 54961 SQ.M</w:t>
+      </w:r>
+      <w:r>
+        <w:rPr>
+          <w:rFonts w:ascii="Helvetica Neue" w:hAnsi="Helvetica Neue" w:cs="Helvetica Neue"/>
+          <w:sz w:val="29"/>
+          <w:sz-cs w:val="29"/>
+          <w:spacing w:val="0"/>
+          <w:color w:val="181E2A"/>
+        </w:rPr>
+        <w:t xml:space="preserve">). Each seeded parcel is matched to its model ring by a scale-invariant shape fingerprint (vertex count + isoperimetric factor); the label inside the ring supplies the drawing code and display name. 42 of 55 parcels carry real drawing codes (duplicated codes on the plan get a </w:t>
+      </w:r>
+      <w:r>
+        <w:rPr>
+          <w:rFonts w:ascii="Menlo" w:hAnsi="Menlo" w:cs="Menlo"/>
+          <w:sz w:val="25"/>
+          <w:sz-cs w:val="25"/>
+          <w:spacing w:val="0"/>
+          <w:color w:val="181E2A"/>
+        </w:rPr>
+        <w:t xml:space="preserve">b</w:t>
+      </w:r>
+      <w:r>
+        <w:rPr>
+          <w:rFonts w:ascii="Helvetica Neue" w:hAnsi="Helvetica Neue" w:cs="Helvetica Neue"/>
+          <w:sz w:val="29"/>
+          <w:sz-cs w:val="29"/>
+          <w:spacing w:val="0"/>
+          <w:color w:val="181E2A"/>
+        </w:rPr>
+        <w:t xml:space="preserve">/</w:t>
+      </w:r>
+      <w:r>
+        <w:rPr>
+          <w:rFonts w:ascii="Menlo" w:hAnsi="Menlo" w:cs="Menlo"/>
+          <w:sz w:val="25"/>
+          <w:sz-cs w:val="25"/>
+          <w:spacing w:val="0"/>
+          <w:color w:val="181E2A"/>
+        </w:rPr>
+        <w:t xml:space="preserve">c</w:t>
+      </w:r>
+      <w:r>
+        <w:rPr>
+          <w:rFonts w:ascii="Helvetica Neue" w:hAnsi="Helvetica Neue" w:cs="Helvetica Neue"/>
+          <w:sz w:val="29"/>
+          <w:sz-cs w:val="29"/>
+          <w:spacing w:val="0"/>
+          <w:color w:val="181E2A"/>
+        </w:rPr>
+        <w:t xml:space="preserve"> suffix); the 13 parcels with no label in the drawing keep synthesised </w:t>
       </w:r>
       <w:r>
         <w:rPr>
@@ -6563,7 +6690,148 @@
           <w:spacing w:val="0"/>
           <w:color w:val="181E2A"/>
         </w:rPr>
-        <w:t xml:space="preserve"> codes that can be renamed once a label-bearing DXF export is available.</w:t>
+        <w:t xml:space="preserve"> codes.</w:t>
+      </w:r>
+    </w:p>
+    <w:p>
+      <w:pPr>
+        <w:ind w:left="720" w:first-line="-720"/>
+        <w:spacing w:after="293"/>
+      </w:pPr>
+      <w:r>
+        <w:rPr>
+          <w:rFonts w:ascii="Helvetica Neue" w:hAnsi="Helvetica Neue" w:cs="Helvetica Neue"/>
+          <w:sz w:val="29"/>
+          <w:sz-cs w:val="29"/>
+          <w:b/>
+          <w:color w:val="181E2A"/>
+        </w:rPr>
+        <w:t xml:space="preserve"/>
+        <w:tab/>
+        <w:t xml:space="preserve">9</w:t>
+        <w:tab/>
+        <w:t xml:space="preserve"/>
+      </w:r>
+      <w:r>
+        <w:rPr>
+          <w:rFonts w:ascii="Helvetica Neue" w:hAnsi="Helvetica Neue" w:cs="Helvetica Neue"/>
+          <w:sz w:val="29"/>
+          <w:sz-cs w:val="29"/>
+          <w:b/>
+          <w:spacing w:val="0"/>
+          <w:color w:val="181E2A"/>
+        </w:rPr>
+        <w:t xml:space="preserve">Scale correction.</w:t>
+      </w:r>
+      <w:r>
+        <w:rPr>
+          <w:rFonts w:ascii="Helvetica Neue" w:hAnsi="Helvetica Neue" w:cs="Helvetica Neue"/>
+          <w:sz w:val="29"/>
+          <w:sz-cs w:val="29"/>
+          <w:spacing w:val="0"/>
+          <w:color w:val="181E2A"/>
+        </w:rPr>
+        <w:t xml:space="preserve"> Matching also revealed that the aspose DXF export scales geometry by ≈ 0.3917 (k = 2.5533 back to true metres, stdev 0.015, 53 matched parcels). The label recovery step rescales </w:t>
+      </w:r>
+      <w:r>
+        <w:rPr>
+          <w:rFonts w:ascii="Menlo" w:hAnsi="Menlo" w:cs="Menlo"/>
+          <w:sz w:val="25"/>
+          <w:sz-cs w:val="25"/>
+          <w:spacing w:val="0"/>
+          <w:color w:val="181E2A"/>
+        </w:rPr>
+        <w:t xml:space="preserve">svgPath</w:t>
+      </w:r>
+      <w:r>
+        <w:rPr>
+          <w:rFonts w:ascii="Helvetica Neue" w:hAnsi="Helvetica Neue" w:cs="Helvetica Neue"/>
+          <w:sz w:val="29"/>
+          <w:sz-cs w:val="29"/>
+          <w:spacing w:val="0"/>
+          <w:color w:val="181E2A"/>
+        </w:rPr>
+        <w:t xml:space="preserve">, </w:t>
+      </w:r>
+      <w:r>
+        <w:rPr>
+          <w:rFonts w:ascii="Menlo" w:hAnsi="Menlo" w:cs="Menlo"/>
+          <w:sz w:val="25"/>
+          <w:sz-cs w:val="25"/>
+          <w:spacing w:val="0"/>
+          <w:color w:val="181E2A"/>
+        </w:rPr>
+        <w:t xml:space="preserve">centroid</w:t>
+      </w:r>
+      <w:r>
+        <w:rPr>
+          <w:rFonts w:ascii="Helvetica Neue" w:hAnsi="Helvetica Neue" w:cs="Helvetica Neue"/>
+          <w:sz w:val="29"/>
+          <w:sz-cs w:val="29"/>
+          <w:spacing w:val="0"/>
+          <w:color w:val="181E2A"/>
+        </w:rPr>
+        <w:t xml:space="preserve">, </w:t>
+      </w:r>
+      <w:r>
+        <w:rPr>
+          <w:rFonts w:ascii="Menlo" w:hAnsi="Menlo" w:cs="Menlo"/>
+          <w:sz w:val="25"/>
+          <w:sz-cs w:val="25"/>
+          <w:spacing w:val="0"/>
+          <w:color w:val="181E2A"/>
+        </w:rPr>
+        <w:t xml:space="preserve">boundaryWkt</w:t>
+      </w:r>
+      <w:r>
+        <w:rPr>
+          <w:rFonts w:ascii="Helvetica Neue" w:hAnsi="Helvetica Neue" w:cs="Helvetica Neue"/>
+          <w:sz w:val="29"/>
+          <w:sz-cs w:val="29"/>
+          <w:spacing w:val="0"/>
+          <w:color w:val="181E2A"/>
+        </w:rPr>
+        <w:t xml:space="preserve"> and </w:t>
+      </w:r>
+      <w:r>
+        <w:rPr>
+          <w:rFonts w:ascii="Menlo" w:hAnsi="Menlo" w:cs="Menlo"/>
+          <w:sz w:val="25"/>
+          <w:sz-cs w:val="25"/>
+          <w:spacing w:val="0"/>
+          <w:color w:val="181E2A"/>
+        </w:rPr>
+        <w:t xml:space="preserve">areaHectares</w:t>
+      </w:r>
+      <w:r>
+        <w:rPr>
+          <w:rFonts w:ascii="Helvetica Neue" w:hAnsi="Helvetica Neue" w:cs="Helvetica Neue"/>
+          <w:sz w:val="29"/>
+          <w:sz-cs w:val="29"/>
+          <w:spacing w:val="0"/>
+          <w:color w:val="181E2A"/>
+        </w:rPr>
+        <w:t xml:space="preserve"> to true metres — confirmed by the drawing's own quoted areas (e.g. ring labelled </w:t>
+      </w:r>
+      <w:r>
+        <w:rPr>
+          <w:rFonts w:ascii="Menlo" w:hAnsi="Menlo" w:cs="Menlo"/>
+          <w:sz w:val="25"/>
+          <w:sz-cs w:val="25"/>
+          <w:spacing w:val="0"/>
+          <w:color w:val="181E2A"/>
+        </w:rPr>
+        <w:t xml:space="preserve">338259 SQ.M</w:t>
+      </w:r>
+      <w:r>
+        <w:rPr>
+          <w:rFonts w:ascii="Helvetica Neue" w:hAnsi="Helvetica Neue" w:cs="Helvetica Neue"/>
+          <w:sz w:val="29"/>
+          <w:sz-cs w:val="29"/>
+          <w:spacing w:val="0"/>
+          <w:color w:val="181E2A"/>
+        </w:rPr>
+        <w:t xml:space="preserve"> → 33.83 ha).</w:t>
       </w:r>
     </w:p>
     <w:p>
@@ -6683,7 +6951,7 @@
           <w:spacing w:val="0"/>
           <w:color w:val="181E2A"/>
         </w:rPr>
-        <w:t xml:space="preserve">Within Phase 1A extent (centroid X cut-off)</w:t>
+        <w:t xml:space="preserve">Within Phase 1A extent polygon</w:t>
       </w:r>
     </w:p>
     <w:p>
@@ -6698,7 +6966,7 @@
           <w:spacing w:val="0"/>
           <w:color w:val="181E2A"/>
         </w:rPr>
-        <w:t xml:space="preserve">278</w:t>
+        <w:t xml:space="preserve">119</w:t>
       </w:r>
     </w:p>
     <w:p>
@@ -6801,7 +7069,7 @@
           <w:spacing w:val="0"/>
           <w:color w:val="181E2A"/>
         </w:rPr>
-        <w:t xml:space="preserve">Named parcels (locked = non-selectable infrastructure):</w:t>
+        <w:t xml:space="preserve">Largest parcels (codes/names from the drawing labels; locked = non-selectable):</w:t>
       </w:r>
     </w:p>
     <w:p>
@@ -6878,20 +7146,20 @@
           <w:spacing w:val="0"/>
           <w:color w:val="181E2A"/>
         </w:rPr>
-        <w:t xml:space="preserve">e001</w:t>
-      </w:r>
-    </w:p>
-    <w:p>
-      <w:pPr/>
-      <w:r>
-        <w:rPr>
-          <w:rFonts w:ascii="Helvetica Neue" w:hAnsi="Helvetica Neue" w:cs="Helvetica Neue"/>
-          <w:sz w:val="26"/>
-          <w:sz-cs w:val="26"/>
-          <w:spacing w:val="0"/>
-          <w:color w:val="181E2A"/>
-        </w:rPr>
-        <w:t xml:space="preserve">Existing Development</w:t>
+        <w:t xml:space="preserve">l005</w:t>
+      </w:r>
+    </w:p>
+    <w:p>
+      <w:pPr/>
+      <w:r>
+        <w:rPr>
+          <w:rFonts w:ascii="Helvetica Neue" w:hAnsi="Helvetica Neue" w:cs="Helvetica Neue"/>
+          <w:sz w:val="26"/>
+          <w:sz-cs w:val="26"/>
+          <w:spacing w:val="0"/>
+          <w:color w:val="181E2A"/>
+        </w:rPr>
+        <w:t xml:space="preserve">L2E Tower (Inland Port Logistics)</w:t>
       </w:r>
     </w:p>
     <w:p>
@@ -6906,7 +7174,7 @@
           <w:spacing w:val="0"/>
           <w:color w:val="181E2A"/>
         </w:rPr>
-        <w:t xml:space="preserve">5.19</w:t>
+        <w:t xml:space="preserve">33.83</w:t>
       </w:r>
     </w:p>
     <w:p>
@@ -6934,20 +7202,20 @@
           <w:spacing w:val="0"/>
           <w:color w:val="181E2A"/>
         </w:rPr>
-        <w:t xml:space="preserve">i001</w:t>
-      </w:r>
-    </w:p>
-    <w:p>
-      <w:pPr/>
-      <w:r>
-        <w:rPr>
-          <w:rFonts w:ascii="Helvetica Neue" w:hAnsi="Helvetica Neue" w:cs="Helvetica Neue"/>
-          <w:sz w:val="26"/>
-          <w:sz-cs w:val="26"/>
-          <w:spacing w:val="0"/>
-          <w:color w:val="181E2A"/>
-        </w:rPr>
-        <w:t xml:space="preserve">Insignia</w:t>
+        <w:t xml:space="preserve">i011</w:t>
+      </w:r>
+    </w:p>
+    <w:p>
+      <w:pPr/>
+      <w:r>
+        <w:rPr>
+          <w:rFonts w:ascii="Helvetica Neue" w:hAnsi="Helvetica Neue" w:cs="Helvetica Neue"/>
+          <w:sz w:val="26"/>
+          <w:sz-cs w:val="26"/>
+          <w:spacing w:val="0"/>
+          <w:color w:val="181E2A"/>
+        </w:rPr>
+        <w:t xml:space="preserve">Future Industry</w:t>
       </w:r>
     </w:p>
     <w:p>
@@ -6962,7 +7230,7 @@
           <w:spacing w:val="0"/>
           <w:color w:val="181E2A"/>
         </w:rPr>
-        <w:t xml:space="preserve">3.84</w:t>
+        <w:t xml:space="preserve">25.03</w:t>
       </w:r>
     </w:p>
     <w:p>
@@ -6990,7 +7258,63 @@
           <w:spacing w:val="0"/>
           <w:color w:val="181E2A"/>
         </w:rPr>
-        <w:t xml:space="preserve">r001</w:t>
+        <w:t xml:space="preserve">i009</w:t>
+      </w:r>
+    </w:p>
+    <w:p>
+      <w:pPr/>
+      <w:r>
+        <w:rPr>
+          <w:rFonts w:ascii="Helvetica Neue" w:hAnsi="Helvetica Neue" w:cs="Helvetica Neue"/>
+          <w:sz w:val="26"/>
+          <w:sz-cs w:val="26"/>
+          <w:spacing w:val="0"/>
+          <w:color w:val="181E2A"/>
+        </w:rPr>
+        <w:t xml:space="preserve">LFZ Camp</w:t>
+      </w:r>
+    </w:p>
+    <w:p>
+      <w:pPr>
+        <w:jc w:val="right"/>
+      </w:pPr>
+      <w:r>
+        <w:rPr>
+          <w:rFonts w:ascii="Helvetica Neue" w:hAnsi="Helvetica Neue" w:cs="Helvetica Neue"/>
+          <w:sz w:val="26"/>
+          <w:sz-cs w:val="26"/>
+          <w:spacing w:val="0"/>
+          <w:color w:val="181E2A"/>
+        </w:rPr>
+        <w:t xml:space="preserve">8.32</w:t>
+      </w:r>
+    </w:p>
+    <w:p>
+      <w:pPr>
+        <w:jc w:val="center"/>
+      </w:pPr>
+      <w:r>
+        <w:rPr>
+          <w:rFonts w:ascii="Helvetica Neue" w:hAnsi="Helvetica Neue" w:cs="Helvetica Neue"/>
+          <w:sz w:val="26"/>
+          <w:sz-cs w:val="26"/>
+          <w:spacing w:val="0"/>
+          <w:color w:val="181E2A"/>
+        </w:rPr>
+        <w:t xml:space="preserve"/>
+      </w:r>
+    </w:p>
+    <w:p>
+      <w:pPr/>
+      <w:r>
+        <w:rPr>
+          <w:rFonts w:ascii="Helvetica Neue" w:hAnsi="Helvetica Neue" w:cs="Helvetica Neue"/>
+          <w:sz w:val="26"/>
+          <w:sz-cs w:val="26"/>
+          <w:spacing w:val="0"/>
+          <w:color w:val="181E2A"/>
+        </w:rPr>
+        <w:t xml:space="preserve">i003</w:t>
       </w:r>
     </w:p>
     <w:p>
@@ -7018,7 +7342,7 @@
           <w:spacing w:val="0"/>
           <w:color w:val="181E2A"/>
         </w:rPr>
-        <w:t xml:space="preserve">1.28</w:t>
+        <w:t xml:space="preserve">6.02</w:t>
       </w:r>
     </w:p>
     <w:p>
@@ -7046,20 +7370,20 @@
           <w:spacing w:val="0"/>
           <w:color w:val="181E2A"/>
         </w:rPr>
-        <w:t xml:space="preserve">k001</w:t>
-      </w:r>
-    </w:p>
-    <w:p>
-      <w:pPr/>
-      <w:r>
-        <w:rPr>
-          <w:rFonts w:ascii="Helvetica Neue" w:hAnsi="Helvetica Neue" w:cs="Helvetica Neue"/>
-          <w:sz w:val="26"/>
-          <w:sz-cs w:val="26"/>
-          <w:spacing w:val="0"/>
-          <w:color w:val="181E2A"/>
-        </w:rPr>
-        <w:t xml:space="preserve">Kellogg's</w:t>
+        <w:t xml:space="preserve">i004</w:t>
+      </w:r>
+    </w:p>
+    <w:p>
+      <w:pPr/>
+      <w:r>
+        <w:rPr>
+          <w:rFonts w:ascii="Helvetica Neue" w:hAnsi="Helvetica Neue" w:cs="Helvetica Neue"/>
+          <w:sz w:val="26"/>
+          <w:sz-cs w:val="26"/>
+          <w:spacing w:val="0"/>
+          <w:color w:val="181E2A"/>
+        </w:rPr>
+        <w:t xml:space="preserve">TG Arla</w:t>
       </w:r>
     </w:p>
     <w:p>
@@ -7074,7 +7398,7 @@
           <w:spacing w:val="0"/>
           <w:color w:val="181E2A"/>
         </w:rPr>
-        <w:t xml:space="preserve">0.92</w:t>
+        <w:t xml:space="preserve">6.00</w:t>
       </w:r>
     </w:p>
     <w:p>
@@ -7102,20 +7426,20 @@
           <w:spacing w:val="0"/>
           <w:color w:val="181E2A"/>
         </w:rPr>
-        <w:t xml:space="preserve">a001</w:t>
-      </w:r>
-    </w:p>
-    <w:p>
-      <w:pPr/>
-      <w:r>
-        <w:rPr>
-          <w:rFonts w:ascii="Helvetica Neue" w:hAnsi="Helvetica Neue" w:cs="Helvetica Neue"/>
-          <w:sz w:val="26"/>
-          <w:sz-cs w:val="26"/>
-          <w:spacing w:val="0"/>
-          <w:color w:val="181E2A"/>
-        </w:rPr>
-        <w:t xml:space="preserve">TG Arla</w:t>
+        <w:t xml:space="preserve">i004b</w:t>
+      </w:r>
+    </w:p>
+    <w:p>
+      <w:pPr/>
+      <w:r>
+        <w:rPr>
+          <w:rFonts w:ascii="Helvetica Neue" w:hAnsi="Helvetica Neue" w:cs="Helvetica Neue"/>
+          <w:sz w:val="26"/>
+          <w:sz-cs w:val="26"/>
+          <w:spacing w:val="0"/>
+          <w:color w:val="181E2A"/>
+        </w:rPr>
+        <w:t xml:space="preserve">TG Colgate Phase I</w:t>
       </w:r>
     </w:p>
     <w:p>
@@ -7130,7 +7454,7 @@
           <w:spacing w:val="0"/>
           <w:color w:val="181E2A"/>
         </w:rPr>
-        <w:t xml:space="preserve">0.92</w:t>
+        <w:t xml:space="preserve">5.50</w:t>
       </w:r>
     </w:p>
     <w:p>
@@ -7158,20 +7482,20 @@
           <w:spacing w:val="0"/>
           <w:color w:val="181E2A"/>
         </w:rPr>
-        <w:t xml:space="preserve">c001</w:t>
-      </w:r>
-    </w:p>
-    <w:p>
-      <w:pPr/>
-      <w:r>
-        <w:rPr>
-          <w:rFonts w:ascii="Helvetica Neue" w:hAnsi="Helvetica Neue" w:cs="Helvetica Neue"/>
-          <w:sz w:val="26"/>
-          <w:sz-cs w:val="26"/>
-          <w:spacing w:val="0"/>
-          <w:color w:val="181E2A"/>
-        </w:rPr>
-        <w:t xml:space="preserve">TG Colgate Phase I</w:t>
+        <w:t xml:space="preserve">c002</w:t>
+      </w:r>
+    </w:p>
+    <w:p>
+      <w:pPr/>
+      <w:r>
+        <w:rPr>
+          <w:rFonts w:ascii="Helvetica Neue" w:hAnsi="Helvetica Neue" w:cs="Helvetica Neue"/>
+          <w:sz w:val="26"/>
+          <w:sz-cs w:val="26"/>
+          <w:spacing w:val="0"/>
+          <w:color w:val="181E2A"/>
+        </w:rPr>
+        <w:t xml:space="preserve">Carton Factory</w:t>
       </w:r>
     </w:p>
     <w:p>
@@ -7186,7 +7510,7 @@
           <w:spacing w:val="0"/>
           <w:color w:val="181E2A"/>
         </w:rPr>
-        <w:t xml:space="preserve">0.84</w:t>
+        <w:t xml:space="preserve">5.00</w:t>
       </w:r>
     </w:p>
     <w:p>
@@ -7214,20 +7538,20 @@
           <w:spacing w:val="0"/>
           <w:color w:val="181E2A"/>
         </w:rPr>
-        <w:t xml:space="preserve">c002</w:t>
-      </w:r>
-    </w:p>
-    <w:p>
-      <w:pPr/>
-      <w:r>
-        <w:rPr>
-          <w:rFonts w:ascii="Helvetica Neue" w:hAnsi="Helvetica Neue" w:cs="Helvetica Neue"/>
-          <w:sz w:val="26"/>
-          <w:sz-cs w:val="26"/>
-          <w:spacing w:val="0"/>
-          <w:color w:val="181E2A"/>
-        </w:rPr>
-        <w:t xml:space="preserve">TG Colgate Phase II</w:t>
+        <w:t xml:space="preserve">i028</w:t>
+      </w:r>
+    </w:p>
+    <w:p>
+      <w:pPr/>
+      <w:r>
+        <w:rPr>
+          <w:rFonts w:ascii="Helvetica Neue" w:hAnsi="Helvetica Neue" w:cs="Helvetica Neue"/>
+          <w:sz w:val="26"/>
+          <w:sz-cs w:val="26"/>
+          <w:spacing w:val="0"/>
+          <w:color w:val="181E2A"/>
+        </w:rPr>
+        <w:t xml:space="preserve">Heavy Vehicle Park</w:t>
       </w:r>
     </w:p>
     <w:p>
@@ -7242,7 +7566,7 @@
           <w:spacing w:val="0"/>
           <w:color w:val="181E2A"/>
         </w:rPr>
-        <w:t xml:space="preserve">0.77</w:t>
+        <w:t xml:space="preserve">4.86</w:t>
       </w:r>
     </w:p>
     <w:p>
@@ -7257,33 +7581,33 @@
           <w:spacing w:val="0"/>
           <w:color w:val="181E2A"/>
         </w:rPr>
-        <w:t xml:space="preserve"/>
-      </w:r>
-    </w:p>
-    <w:p>
-      <w:pPr/>
-      <w:r>
-        <w:rPr>
-          <w:rFonts w:ascii="Helvetica Neue" w:hAnsi="Helvetica Neue" w:cs="Helvetica Neue"/>
-          <w:sz w:val="26"/>
-          <w:sz-cs w:val="26"/>
-          <w:spacing w:val="0"/>
-          <w:color w:val="181E2A"/>
-        </w:rPr>
-        <w:t xml:space="preserve">h001</w:t>
-      </w:r>
-    </w:p>
-    <w:p>
-      <w:pPr/>
-      <w:r>
-        <w:rPr>
-          <w:rFonts w:ascii="Helvetica Neue" w:hAnsi="Helvetica Neue" w:cs="Helvetica Neue"/>
-          <w:sz w:val="26"/>
-          <w:sz-cs w:val="26"/>
-          <w:spacing w:val="0"/>
-          <w:color w:val="181E2A"/>
-        </w:rPr>
-        <w:t xml:space="preserve">Heavy Vehicle Park</w:t>
+        <w:t xml:space="preserve">✔</w:t>
+      </w:r>
+    </w:p>
+    <w:p>
+      <w:pPr/>
+      <w:r>
+        <w:rPr>
+          <w:rFonts w:ascii="Helvetica Neue" w:hAnsi="Helvetica Neue" w:cs="Helvetica Neue"/>
+          <w:sz w:val="26"/>
+          <w:sz-cs w:val="26"/>
+          <w:spacing w:val="0"/>
+          <w:color w:val="181E2A"/>
+        </w:rPr>
+        <w:t xml:space="preserve">l004</w:t>
+      </w:r>
+    </w:p>
+    <w:p>
+      <w:pPr/>
+      <w:r>
+        <w:rPr>
+          <w:rFonts w:ascii="Helvetica Neue" w:hAnsi="Helvetica Neue" w:cs="Helvetica Neue"/>
+          <w:sz w:val="26"/>
+          <w:sz-cs w:val="26"/>
+          <w:spacing w:val="0"/>
+          <w:color w:val="181E2A"/>
+        </w:rPr>
+        <w:t xml:space="preserve">Customs CP1</w:t>
       </w:r>
     </w:p>
     <w:p>
@@ -7298,7 +7622,7 @@
           <w:spacing w:val="0"/>
           <w:color w:val="181E2A"/>
         </w:rPr>
-        <w:t xml:space="preserve">0.75</w:t>
+        <w:t xml:space="preserve">4.78</w:t>
       </w:r>
     </w:p>
     <w:p>
@@ -7326,20 +7650,20 @@
           <w:spacing w:val="0"/>
           <w:color w:val="181E2A"/>
         </w:rPr>
-        <w:t xml:space="preserve">cp01</w:t>
-      </w:r>
-    </w:p>
-    <w:p>
-      <w:pPr/>
-      <w:r>
-        <w:rPr>
-          <w:rFonts w:ascii="Helvetica Neue" w:hAnsi="Helvetica Neue" w:cs="Helvetica Neue"/>
-          <w:sz w:val="26"/>
-          <w:sz-cs w:val="26"/>
-          <w:spacing w:val="0"/>
-          <w:color w:val="181E2A"/>
-        </w:rPr>
-        <w:t xml:space="preserve">Customs CP1</w:t>
+        <w:t xml:space="preserve">i002</w:t>
+      </w:r>
+    </w:p>
+    <w:p>
+      <w:pPr/>
+      <w:r>
+        <w:rPr>
+          <w:rFonts w:ascii="Helvetica Neue" w:hAnsi="Helvetica Neue" w:cs="Helvetica Neue"/>
+          <w:sz w:val="26"/>
+          <w:sz-cs w:val="26"/>
+          <w:spacing w:val="0"/>
+          <w:color w:val="181E2A"/>
+        </w:rPr>
+        <w:t xml:space="preserve">Customs CP2</w:t>
       </w:r>
     </w:p>
     <w:p>
@@ -7354,7 +7678,7 @@
           <w:spacing w:val="0"/>
           <w:color w:val="181E2A"/>
         </w:rPr>
-        <w:t xml:space="preserve">0.73</w:t>
+        <w:t xml:space="preserve">4.57</w:t>
       </w:r>
     </w:p>
     <w:p>
@@ -7382,20 +7706,20 @@
           <w:spacing w:val="0"/>
           <w:color w:val="181E2A"/>
         </w:rPr>
-        <w:t xml:space="preserve">cp02</w:t>
-      </w:r>
-    </w:p>
-    <w:p>
-      <w:pPr/>
-      <w:r>
-        <w:rPr>
-          <w:rFonts w:ascii="Helvetica Neue" w:hAnsi="Helvetica Neue" w:cs="Helvetica Neue"/>
-          <w:sz w:val="26"/>
-          <w:sz-cs w:val="26"/>
-          <w:spacing w:val="0"/>
-          <w:color w:val="181E2A"/>
-        </w:rPr>
-        <w:t xml:space="preserve">Customs CP2</w:t>
+        <w:t xml:space="preserve">…</w:t>
+      </w:r>
+    </w:p>
+    <w:p>
+      <w:pPr/>
+      <w:r>
+        <w:rPr>
+          <w:rFonts w:ascii="Helvetica Neue" w:hAnsi="Helvetica Neue" w:cs="Helvetica Neue"/>
+          <w:sz w:val="26"/>
+          <w:sz-cs w:val="26"/>
+          <w:spacing w:val="0"/>
+          <w:color w:val="181E2A"/>
+        </w:rPr>
+        <w:t xml:space="preserve">32 more labelled + 13 unlabelled (IND-nnn)</w:t>
       </w:r>
     </w:p>
     <w:p>
@@ -7410,7 +7734,7 @@
           <w:spacing w:val="0"/>
           <w:color w:val="181E2A"/>
         </w:rPr>
-        <w:t xml:space="preserve">0.70</w:t>
+        <w:t xml:space="preserve">0.66–4.46</w:t>
       </w:r>
     </w:p>
     <w:p>
@@ -7425,63 +7749,43 @@
           <w:spacing w:val="0"/>
           <w:color w:val="181E2A"/>
         </w:rPr>
-        <w:t xml:space="preserve">✔</w:t>
-      </w:r>
-    </w:p>
-    <w:p>
-      <w:pPr/>
-      <w:r>
-        <w:rPr>
-          <w:rFonts w:ascii="Helvetica Neue" w:hAnsi="Helvetica Neue" w:cs="Helvetica Neue"/>
-          <w:sz w:val="26"/>
-          <w:sz-cs w:val="26"/>
-          <w:spacing w:val="0"/>
-          <w:color w:val="181E2A"/>
-        </w:rPr>
-        <w:t xml:space="preserve">IND-001…IND-045</w:t>
-      </w:r>
-    </w:p>
-    <w:p>
-      <w:pPr/>
-      <w:r>
-        <w:rPr>
-          <w:rFonts w:ascii="Helvetica Neue" w:hAnsi="Helvetica Neue" w:cs="Helvetica Neue"/>
-          <w:sz w:val="26"/>
-          <w:sz-cs w:val="26"/>
-          <w:spacing w:val="0"/>
-          <w:color w:val="181E2A"/>
-        </w:rPr>
-        <w:t xml:space="preserve">Industrial plots</w:t>
-      </w:r>
-    </w:p>
-    <w:p>
-      <w:pPr>
-        <w:jc w:val="right"/>
-      </w:pPr>
-      <w:r>
-        <w:rPr>
-          <w:rFonts w:ascii="Helvetica Neue" w:hAnsi="Helvetica Neue" w:cs="Helvetica Neue"/>
-          <w:sz w:val="26"/>
-          <w:sz-cs w:val="26"/>
-          <w:spacing w:val="0"/>
-          <w:color w:val="181E2A"/>
-        </w:rPr>
-        <w:t xml:space="preserve">0.10–0.68</w:t>
-      </w:r>
-    </w:p>
-    <w:p>
-      <w:pPr>
-        <w:jc w:val="center"/>
-      </w:pPr>
-      <w:r>
-        <w:rPr>
-          <w:rFonts w:ascii="Helvetica Neue" w:hAnsi="Helvetica Neue" w:cs="Helvetica Neue"/>
-          <w:sz w:val="26"/>
-          <w:sz-cs w:val="26"/>
-          <w:spacing w:val="0"/>
-          <w:color w:val="181E2A"/>
-        </w:rPr>
-        <w:t xml:space="preserve"/>
+        <w:t xml:space="preserve"/>
+      </w:r>
+    </w:p>
+    <w:p>
+      <w:pPr>
+        <w:spacing w:after="293"/>
+      </w:pPr>
+      <w:r>
+        <w:rPr>
+          <w:rFonts w:ascii="Helvetica Neue" w:hAnsi="Helvetica Neue" w:cs="Helvetica Neue"/>
+          <w:sz w:val="29"/>
+          <w:sz-cs w:val="29"/>
+          <w:spacing w:val="0"/>
+          <w:color w:val="181E2A"/>
+        </w:rPr>
+        <w:t xml:space="preserve">Total seeded area: </w:t>
+      </w:r>
+      <w:r>
+        <w:rPr>
+          <w:rFonts w:ascii="Helvetica Neue" w:hAnsi="Helvetica Neue" w:cs="Helvetica Neue"/>
+          <w:sz w:val="29"/>
+          <w:sz-cs w:val="29"/>
+          <w:b/>
+          <w:spacing w:val="0"/>
+          <w:color w:val="181E2A"/>
+        </w:rPr>
+        <w:t xml:space="preserve">219.2 ha</w:t>
+      </w:r>
+      <w:r>
+        <w:rPr>
+          <w:rFonts w:ascii="Helvetica Neue" w:hAnsi="Helvetica Neue" w:cs="Helvetica Neue"/>
+          <w:sz w:val="29"/>
+          <w:sz-cs w:val="29"/>
+          <w:spacing w:val="0"/>
+          <w:color w:val="181E2A"/>
+        </w:rPr>
+        <w:t xml:space="preserve"> (true metres).</w:t>
       </w:r>
     </w:p>
     <w:p>
@@ -7525,28 +7829,69 @@
           <w:spacing w:val="0"/>
           <w:color w:val="181E2A"/>
         </w:rPr>
-        <w:t xml:space="preserve">Raw drawing units are </w:t>
-      </w:r>
-      <w:r>
-        <w:rPr>
-          <w:rFonts w:ascii="Helvetica Neue" w:hAnsi="Helvetica Neue" w:cs="Helvetica Neue"/>
-          <w:sz w:val="29"/>
-          <w:sz-cs w:val="29"/>
-          <w:b/>
-          <w:spacing w:val="0"/>
-          <w:color w:val="181E2A"/>
-        </w:rPr>
-        <w:t xml:space="preserve">centimetres</w:t>
-      </w:r>
-      <w:r>
-        <w:rPr>
-          <w:rFonts w:ascii="Helvetica Neue" w:hAnsi="Helvetica Neue" w:cs="Helvetica Neue"/>
-          <w:sz w:val="29"/>
-          <w:sz-cs w:val="29"/>
-          <w:spacing w:val="0"/>
-          <w:color w:val="181E2A"/>
-        </w:rPr>
-        <w:t xml:space="preserve"> (1 unit = 0.01 m). Polygon area / 10⁸ = hectares.</w:t>
+        <w:t xml:space="preserve">Raw DXF-export units are </w:t>
+      </w:r>
+      <w:r>
+        <w:rPr>
+          <w:rFonts w:ascii="Helvetica Neue" w:hAnsi="Helvetica Neue" w:cs="Helvetica Neue"/>
+          <w:sz w:val="29"/>
+          <w:sz-cs w:val="29"/>
+          <w:b/>
+          <w:spacing w:val="0"/>
+          <w:color w:val="181E2A"/>
+        </w:rPr>
+        <w:t xml:space="preserve">centimetres at 0.3917× scale</w:t>
+      </w:r>
+      <w:r>
+        <w:rPr>
+          <w:rFonts w:ascii="Helvetica Neue" w:hAnsi="Helvetica Neue" w:cs="Helvetica Neue"/>
+          <w:sz w:val="29"/>
+          <w:sz-cs w:val="29"/>
+          <w:spacing w:val="0"/>
+          <w:color w:val="181E2A"/>
+        </w:rPr>
+        <w:t xml:space="preserve"> (the aspose export shrinks the drawing); </w:t>
+      </w:r>
+      <w:r>
+        <w:rPr>
+          <w:rFonts w:ascii="Menlo" w:hAnsi="Menlo" w:cs="Menlo"/>
+          <w:sz w:val="25"/>
+          <w:sz-cs w:val="25"/>
+          <w:spacing w:val="0"/>
+          <w:color w:val="181E2A"/>
+        </w:rPr>
+        <w:t xml:space="preserve">extract_plot_labels.py</w:t>
+      </w:r>
+      <w:r>
+        <w:rPr>
+          <w:rFonts w:ascii="Helvetica Neue" w:hAnsi="Helvetica Neue" w:cs="Helvetica Neue"/>
+          <w:sz w:val="29"/>
+          <w:sz-cs w:val="29"/>
+          <w:spacing w:val="0"/>
+          <w:color w:val="181E2A"/>
+        </w:rPr>
+        <w:t xml:space="preserve"> rescales the seed to </w:t>
+      </w:r>
+      <w:r>
+        <w:rPr>
+          <w:rFonts w:ascii="Helvetica Neue" w:hAnsi="Helvetica Neue" w:cs="Helvetica Neue"/>
+          <w:sz w:val="29"/>
+          <w:sz-cs w:val="29"/>
+          <w:b/>
+          <w:spacing w:val="0"/>
+          <w:color w:val="181E2A"/>
+        </w:rPr>
+        <w:t xml:space="preserve">true plan metres</w:t>
+      </w:r>
+      <w:r>
+        <w:rPr>
+          <w:rFonts w:ascii="Helvetica Neue" w:hAnsi="Helvetica Neue" w:cs="Helvetica Neue"/>
+          <w:sz w:val="29"/>
+          <w:sz-cs w:val="29"/>
+          <w:spacing w:val="0"/>
+          <w:color w:val="181E2A"/>
+        </w:rPr>
+        <w:t xml:space="preserve"> using the model-space rings. Polygon area / 10⁴ = hectares.</w:t>
       </w:r>
     </w:p>
     <w:p>
@@ -7949,7 +8294,7 @@
           <w:spacing w:val="0"/>
           <w:color w:val="181E2A"/>
         </w:rPr>
-        <w:t xml:space="preserve">dotnet run -- ../../masterplan.dxf --extent-max-x 112667000</w:t>
+        <w:t xml:space="preserve">dotnet run -- ../../masterplan.dxf --extent-wkt phase1a-extent.wkt</w:t>
       </w:r>
     </w:p>
     <w:p>
@@ -7975,7 +8320,33 @@
           <w:spacing w:val="0"/>
           <w:color w:val="181E2A"/>
         </w:rPr>
-        <w:t xml:space="preserve">python3 ../build_prototype.py   # refresh the standalone prototype</w:t>
+        <w:t xml:space="preserve">python3 ../extract_plot_labels.py    # real codes/names + true-metre scale (reads the DWG)</w:t>
+      </w:r>
+    </w:p>
+    <w:p>
+      <w:pPr/>
+      <w:r>
+        <w:rPr>
+          <w:rFonts w:ascii="Menlo" w:hAnsi="Menlo" w:cs="Menlo"/>
+          <w:sz w:val="25"/>
+          <w:sz-cs w:val="25"/>
+          <w:spacing w:val="0"/>
+          <w:color w:val="181E2A"/>
+        </w:rPr>
+        <w:t xml:space="preserve">python3 ../extract_hatch_colors.py   # land-use hatch colours (reads the DWG)</w:t>
+      </w:r>
+    </w:p>
+    <w:p>
+      <w:pPr/>
+      <w:r>
+        <w:rPr>
+          <w:rFonts w:ascii="Menlo" w:hAnsi="Menlo" w:cs="Menlo"/>
+          <w:sz w:val="25"/>
+          <w:sz-cs w:val="25"/>
+          <w:spacing w:val="0"/>
+          <w:color w:val="181E2A"/>
+        </w:rPr>
+        <w:t xml:space="preserve">python3 ../build_prototype.py        # refresh the standalone prototype</w:t>
       </w:r>
     </w:p>
     <w:p>
@@ -8056,17 +8427,37 @@
           <w:spacing w:val="0"/>
           <w:color w:val="181E2A"/>
         </w:rPr>
-        <w:t xml:space="preserve">Extent approximation.</w:t>
-      </w:r>
-      <w:r>
-        <w:rPr>
-          <w:rFonts w:ascii="Helvetica Neue" w:hAnsi="Helvetica Neue" w:cs="Helvetica Neue"/>
-          <w:sz w:val="29"/>
-          <w:sz-cs w:val="29"/>
-          <w:spacing w:val="0"/>
-          <w:color w:val="181E2A"/>
-        </w:rPr>
-        <w:t xml:space="preserve"> The straight-line cut-off yields 55 parcels versus the 56 counted against the true Phase 1A polygon; supply the phase boundary geometry for an exact match.</w:t>
+        <w:t xml:space="preserve">Extent polygon provenance.</w:t>
+      </w:r>
+      <w:r>
+        <w:rPr>
+          <w:rFonts w:ascii="Helvetica Neue" w:hAnsi="Helvetica Neue" w:cs="Helvetica Neue"/>
+          <w:sz w:val="29"/>
+          <w:sz-cs w:val="29"/>
+          <w:spacing w:val="0"/>
+          <w:color w:val="181E2A"/>
+        </w:rPr>
+        <w:t xml:space="preserve"> </w:t>
+      </w:r>
+      <w:r>
+        <w:rPr>
+          <w:rFonts w:ascii="Menlo" w:hAnsi="Menlo" w:cs="Menlo"/>
+          <w:sz w:val="25"/>
+          <w:sz-cs w:val="25"/>
+          <w:spacing w:val="0"/>
+          <w:color w:val="181E2A"/>
+        </w:rPr>
+        <w:t xml:space="preserve">phase1a-extent.wkt</w:t>
+      </w:r>
+      <w:r>
+        <w:rPr>
+          <w:rFonts w:ascii="Helvetica Neue" w:hAnsi="Helvetica Neue" w:cs="Helvetica Neue"/>
+          <w:sz w:val="29"/>
+          <w:sz-cs w:val="29"/>
+          <w:spacing w:val="0"/>
+          <w:color w:val="181E2A"/>
+        </w:rPr>
+        <w:t xml:space="preserve"> is derived from the verified parcel set (union + 10 m margin), not from an official phase boundary — the DWG does not contain one. It is deterministic and exact for the current drawing; replace the file with the official boundary WKT when the drawing office provides it.</w:t>
       </w:r>
     </w:p>
     <w:p>
@@ -8106,7 +8497,27 @@
           <w:spacing w:val="0"/>
           <w:color w:val="181E2A"/>
         </w:rPr>
-        <w:t xml:space="preserve"> Plot codes for unnamed parcels are synthesised (</w:t>
+        <w:t xml:space="preserve"> Resolved: real drawing codes/names are recovered from the DWG model space by </w:t>
+      </w:r>
+      <w:r>
+        <w:rPr>
+          <w:rFonts w:ascii="Menlo" w:hAnsi="Menlo" w:cs="Menlo"/>
+          <w:sz w:val="25"/>
+          <w:sz-cs w:val="25"/>
+          <w:spacing w:val="0"/>
+          <w:color w:val="181E2A"/>
+        </w:rPr>
+        <w:t xml:space="preserve">extract_plot_labels.py</w:t>
+      </w:r>
+      <w:r>
+        <w:rPr>
+          <w:rFonts w:ascii="Helvetica Neue" w:hAnsi="Helvetica Neue" w:cs="Helvetica Neue"/>
+          <w:sz w:val="29"/>
+          <w:sz-cs w:val="29"/>
+          <w:spacing w:val="0"/>
+          <w:color w:val="181E2A"/>
+        </w:rPr>
+        <w:t xml:space="preserve"> (42 of 55 parcels). The remaining 13 parcels genuinely carry no ID label in the drawing and keep synthesised </w:t>
       </w:r>
       <w:r>
         <w:rPr>
@@ -8126,7 +8537,7 @@
           <w:spacing w:val="0"/>
           <w:color w:val="181E2A"/>
         </w:rPr>
-        <w:t xml:space="preserve">). Re-ingesting a label-bearing DXF export lets them be renamed via the Admin UI or a fresh extraction (codes are stable per run, ranked by area).</w:t>
+        <w:t xml:space="preserve"> codes; they can be renamed in the Admin UI.</w:t>
       </w:r>
     </w:p>
     <w:p>
@@ -8166,7 +8577,128 @@
           <w:spacing w:val="0"/>
           <w:color w:val="181E2A"/>
         </w:rPr>
-        <w:t xml:space="preserve"> Not extracted in this run; the </w:t>
+        <w:t xml:space="preserve"> The DWG contains </w:t>
+      </w:r>
+      <w:r>
+        <w:rPr>
+          <w:rFonts w:ascii="Helvetica Neue" w:hAnsi="Helvetica Neue" w:cs="Helvetica Neue"/>
+          <w:sz w:val="29"/>
+          <w:sz-cs w:val="29"/>
+          <w:b/>
+          <w:spacing w:val="0"/>
+          <w:color w:val="181E2A"/>
+        </w:rPr>
+        <w:t xml:space="preserve">no per-plot colour fills</w:t>
+      </w:r>
+      <w:r>
+        <w:rPr>
+          <w:rFonts w:ascii="Helvetica Neue" w:hAnsi="Helvetica Neue" w:cs="Helvetica Neue"/>
+          <w:sz w:val="29"/>
+          <w:sz-cs w:val="29"/>
+          <w:spacing w:val="0"/>
+          <w:color w:val="181E2A"/>
+        </w:rPr>
+        <w:t xml:space="preserve"> — the PDF's plot colouring is a publishing artefact. The DWG does carry legend swatch hatches on the </w:t>
+      </w:r>
+      <w:r>
+        <w:rPr>
+          <w:rFonts w:ascii="Menlo" w:hAnsi="Menlo" w:cs="Menlo"/>
+          <w:sz w:val="25"/>
+          <w:sz-cs w:val="25"/>
+          <w:spacing w:val="0"/>
+          <w:color w:val="181E2A"/>
+        </w:rPr>
+        <w:t xml:space="preserve">LU_*</w:t>
+      </w:r>
+      <w:r>
+        <w:rPr>
+          <w:rFonts w:ascii="Helvetica Neue" w:hAnsi="Helvetica Neue" w:cs="Helvetica Neue"/>
+          <w:sz w:val="29"/>
+          <w:sz-cs w:val="29"/>
+          <w:spacing w:val="0"/>
+          <w:color w:val="181E2A"/>
+        </w:rPr>
+        <w:t xml:space="preserve"> layers; </w:t>
+      </w:r>
+      <w:r>
+        <w:rPr>
+          <w:rFonts w:ascii="Menlo" w:hAnsi="Menlo" w:cs="Menlo"/>
+          <w:sz w:val="25"/>
+          <w:sz-cs w:val="25"/>
+          <w:spacing w:val="0"/>
+          <w:color w:val="181E2A"/>
+        </w:rPr>
+        <w:t xml:space="preserve">tools/extract_hatch_colors.py</w:t>
+      </w:r>
+      <w:r>
+        <w:rPr>
+          <w:rFonts w:ascii="Helvetica Neue" w:hAnsi="Helvetica Neue" w:cs="Helvetica Neue"/>
+          <w:sz w:val="29"/>
+          <w:sz-cs w:val="29"/>
+          <w:spacing w:val="0"/>
+          <w:color w:val="181E2A"/>
+        </w:rPr>
+        <w:t xml:space="preserve"> reads them directly from the DWG (aspose-cad object model, ACI → hex via ezdxf) and applies them to plots by land-use class: </w:t>
+      </w:r>
+      <w:r>
+        <w:rPr>
+          <w:rFonts w:ascii="Menlo" w:hAnsi="Menlo" w:cs="Menlo"/>
+          <w:sz w:val="25"/>
+          <w:sz-cs w:val="25"/>
+          <w:spacing w:val="0"/>
+          <w:color w:val="181E2A"/>
+        </w:rPr>
+        <w:t xml:space="preserve">Existing #FF00BF</w:t>
+      </w:r>
+      <w:r>
+        <w:rPr>
+          <w:rFonts w:ascii="Helvetica Neue" w:hAnsi="Helvetica Neue" w:cs="Helvetica Neue"/>
+          <w:sz w:val="29"/>
+          <w:sz-cs w:val="29"/>
+          <w:spacing w:val="0"/>
+          <w:color w:val="181E2A"/>
+        </w:rPr>
+        <w:t xml:space="preserve"> (LU_Committed Devt), </w:t>
+      </w:r>
+      <w:r>
+        <w:rPr>
+          <w:rFonts w:ascii="Menlo" w:hAnsi="Menlo" w:cs="Menlo"/>
+          <w:sz w:val="25"/>
+          <w:sz-cs w:val="25"/>
+          <w:spacing w:val="0"/>
+          <w:color w:val="181E2A"/>
+        </w:rPr>
+        <w:t xml:space="preserve">Infrastructure #FFFF7F</w:t>
+      </w:r>
+      <w:r>
+        <w:rPr>
+          <w:rFonts w:ascii="Helvetica Neue" w:hAnsi="Helvetica Neue" w:cs="Helvetica Neue"/>
+          <w:sz w:val="29"/>
+          <w:sz-cs w:val="29"/>
+          <w:spacing w:val="0"/>
+          <w:color w:val="181E2A"/>
+        </w:rPr>
+        <w:t xml:space="preserve"> (LU_Roads), </w:t>
+      </w:r>
+      <w:r>
+        <w:rPr>
+          <w:rFonts w:ascii="Menlo" w:hAnsi="Menlo" w:cs="Menlo"/>
+          <w:sz w:val="25"/>
+          <w:sz-cs w:val="25"/>
+          <w:spacing w:val="0"/>
+          <w:color w:val="181E2A"/>
+        </w:rPr>
+        <w:t xml:space="preserve">Green #BFFF7F</w:t>
+      </w:r>
+      <w:r>
+        <w:rPr>
+          <w:rFonts w:ascii="Helvetica Neue" w:hAnsi="Helvetica Neue" w:cs="Helvetica Neue"/>
+          <w:sz w:val="29"/>
+          <w:sz-cs w:val="29"/>
+          <w:spacing w:val="0"/>
+          <w:color w:val="181E2A"/>
+        </w:rPr>
+        <w:t xml:space="preserve"> (LU_Green x Open Space). Industrial plots have no legend colour in the drawing, so their </w:t>
       </w:r>
       <w:r>
         <w:rPr>
@@ -8186,7 +8718,27 @@
           <w:spacing w:val="0"/>
           <w:color w:val="181E2A"/>
         </w:rPr>
-        <w:t xml:space="preserve"> column exists and can be populated by a future extractor pass.</w:t>
+        <w:t xml:space="preserve"> stays null and the UI palette from </w:t>
+      </w:r>
+      <w:r>
+        <w:rPr>
+          <w:rFonts w:ascii="Menlo" w:hAnsi="Menlo" w:cs="Menlo"/>
+          <w:sz w:val="25"/>
+          <w:sz-cs w:val="25"/>
+          <w:spacing w:val="0"/>
+          <w:color w:val="181E2A"/>
+        </w:rPr>
+        <w:t xml:space="preserve">AppSettings</w:t>
+      </w:r>
+      <w:r>
+        <w:rPr>
+          <w:rFonts w:ascii="Helvetica Neue" w:hAnsi="Helvetica Neue" w:cs="Helvetica Neue"/>
+          <w:sz w:val="29"/>
+          <w:sz-cs w:val="29"/>
+          <w:spacing w:val="0"/>
+          <w:color w:val="181E2A"/>
+        </w:rPr>
+        <w:t xml:space="preserve"> applies.</w:t>
       </w:r>
     </w:p>
     <w:sectPr/>

</xml_diff>

<commit_message>
Extend extraction to complete zone (124 parcels, all phases): phase tagging, land-use classification from drawing codes
</commit_message>
<xml_diff>
--- a/LFZ-Project-Documentation.docx
+++ b/LFZ-Project-Documentation.docx
@@ -1377,7 +1377,7 @@
           <w:spacing w:val="0"/>
           <w:color w:val="181E2A"/>
         </w:rPr>
-        <w:t xml:space="preserve">python3 -m venv .venv-cad &amp;&amp; .venv-cad/bin/pip install aspose-cad   # once</w:t>
+        <w:t xml:space="preserve">python3 -m venv .venv-cad &amp;&amp; .venv-cad/bin/pip install aspose-cad shapely ezdxf   # once</w:t>
       </w:r>
     </w:p>
     <w:p>
@@ -1416,7 +1416,7 @@
           <w:spacing w:val="0"/>
           <w:color w:val="181E2A"/>
         </w:rPr>
-        <w:t xml:space="preserve">dotnet run -- ../../masterplan.dxf --extent-wkt phase1a-extent.wkt</w:t>
+        <w:t xml:space="preserve">dotnet run -- ../../masterplan.dxf --codes none        # complete zone, all phases</w:t>
       </w:r>
     </w:p>
     <w:p>
@@ -1442,7 +1442,20 @@
           <w:spacing w:val="0"/>
           <w:color w:val="181E2A"/>
         </w:rPr>
-        <w:t xml:space="preserve">python3 ../extract_plot_labels.py    # real plot codes/names + true-metre scale</w:t>
+        <w:t xml:space="preserve">python3 ../tag_phases.py             # tag phases from extent WKTs</w:t>
+      </w:r>
+    </w:p>
+    <w:p>
+      <w:pPr/>
+      <w:r>
+        <w:rPr>
+          <w:rFonts w:ascii="Menlo" w:hAnsi="Menlo" w:cs="Menlo"/>
+          <w:sz w:val="25"/>
+          <w:sz-cs w:val="25"/>
+          <w:spacing w:val="0"/>
+          <w:color w:val="181E2A"/>
+        </w:rPr>
+        <w:t xml:space="preserve">python3 ../extract_plot_labels.py    # real plot codes/names/land-use + true-metre scale</w:t>
       </w:r>
     </w:p>
     <w:p>
@@ -1504,7 +1517,7 @@
           <w:spacing w:val="0"/>
           <w:color w:val="181E2A"/>
         </w:rPr>
-        <w:t xml:space="preserve"> for the full methodology and current results (414 rings → 55 seeded parcels).</w:t>
+        <w:t xml:space="preserve"> for the full methodology and current results (414 rings → 124 seeded parcels, complete zone).</w:t>
       </w:r>
     </w:p>
     <w:p>
@@ -6378,37 +6391,118 @@
           <w:spacing w:val="0"/>
           <w:color w:val="181E2A"/>
         </w:rPr>
-        <w:t xml:space="preserve">Extent filter.</w:t>
-      </w:r>
-      <w:r>
-        <w:rPr>
-          <w:rFonts w:ascii="Helvetica Neue" w:hAnsi="Helvetica Neue" w:cs="Helvetica Neue"/>
-          <w:sz w:val="29"/>
-          <w:sz-cs w:val="29"/>
-          <w:spacing w:val="0"/>
-          <w:color w:val="181E2A"/>
-        </w:rPr>
-        <w:t xml:space="preserve"> The drawing covers more than Phase 1A and contains no phase-boundary layer (verified against every layer in the drawing — the only boundary-named layers are the small “00 Port Boundary” sub-area and a legend rectangle). The extent is therefore supplied as a WKT polygon (</w:t>
-      </w:r>
-      <w:r>
-        <w:rPr>
-          <w:rFonts w:ascii="Menlo" w:hAnsi="Menlo" w:cs="Menlo"/>
-          <w:sz w:val="25"/>
-          <w:sz-cs w:val="25"/>
-          <w:spacing w:val="0"/>
-          <w:color w:val="181E2A"/>
-        </w:rPr>
-        <w:t xml:space="preserve">--extent-wkt phase1a-extent.wkt</w:t>
-      </w:r>
-      <w:r>
-        <w:rPr>
-          <w:rFonts w:ascii="Helvetica Neue" w:hAnsi="Helvetica Neue" w:cs="Helvetica Neue"/>
-          <w:sz w:val="29"/>
-          <w:sz-cs w:val="29"/>
-          <w:spacing w:val="0"/>
-          <w:color w:val="181E2A"/>
-        </w:rPr>
-        <w:t xml:space="preserve">): a calibrated concave envelope of the verified Phase 1A parcel set (4 parts, 10 m margin) that reproduces the parcel set exactly and deterministically. If an official phase-boundary polygon becomes available, drop its WKT into the same file — no code change. (A legacy </w:t>
+        <w:t xml:space="preserve">Coverage &amp; phase tagging.</w:t>
+      </w:r>
+      <w:r>
+        <w:rPr>
+          <w:rFonts w:ascii="Helvetica Neue" w:hAnsi="Helvetica Neue" w:cs="Helvetica Neue"/>
+          <w:sz w:val="29"/>
+          <w:sz-cs w:val="29"/>
+          <w:spacing w:val="0"/>
+          <w:color w:val="181E2A"/>
+        </w:rPr>
+        <w:t xml:space="preserve"> Extraction is </w:t>
+      </w:r>
+      <w:r>
+        <w:rPr>
+          <w:rFonts w:ascii="Helvetica Neue" w:hAnsi="Helvetica Neue" w:cs="Helvetica Neue"/>
+          <w:sz w:val="29"/>
+          <w:sz-cs w:val="29"/>
+          <w:b/>
+          <w:spacing w:val="0"/>
+          <w:color w:val="181E2A"/>
+        </w:rPr>
+        <w:t xml:space="preserve">zone-wide</w:t>
+      </w:r>
+      <w:r>
+        <w:rPr>
+          <w:rFonts w:ascii="Helvetica Neue" w:hAnsi="Helvetica Neue" w:cs="Helvetica Neue"/>
+          <w:sz w:val="29"/>
+          <w:sz-cs w:val="29"/>
+          <w:spacing w:val="0"/>
+          <w:color w:val="181E2A"/>
+        </w:rPr>
+        <w:t xml:space="preserve"> (no extent filter): every developable parcel in the drawing is seeded. Phases are then tagged by </w:t>
+      </w:r>
+      <w:r>
+        <w:rPr>
+          <w:rFonts w:ascii="Menlo" w:hAnsi="Menlo" w:cs="Menlo"/>
+          <w:sz w:val="25"/>
+          <w:sz-cs w:val="25"/>
+          <w:spacing w:val="0"/>
+          <w:color w:val="181E2A"/>
+        </w:rPr>
+        <w:t xml:space="preserve">tools/tag_phases.py</w:t>
+      </w:r>
+      <w:r>
+        <w:rPr>
+          <w:rFonts w:ascii="Helvetica Neue" w:hAnsi="Helvetica Neue" w:cs="Helvetica Neue"/>
+          <w:sz w:val="29"/>
+          <w:sz-cs w:val="29"/>
+          <w:spacing w:val="0"/>
+          <w:color w:val="181E2A"/>
+        </w:rPr>
+        <w:t xml:space="preserve"> using extent polygons (currently </w:t>
+      </w:r>
+      <w:r>
+        <w:rPr>
+          <w:rFonts w:ascii="Menlo" w:hAnsi="Menlo" w:cs="Menlo"/>
+          <w:sz w:val="25"/>
+          <w:sz-cs w:val="25"/>
+          <w:spacing w:val="0"/>
+          <w:color w:val="181E2A"/>
+        </w:rPr>
+        <w:t xml:space="preserve">phase1a-extent.wkt</w:t>
+      </w:r>
+      <w:r>
+        <w:rPr>
+          <w:rFonts w:ascii="Helvetica Neue" w:hAnsi="Helvetica Neue" w:cs="Helvetica Neue"/>
+          <w:sz w:val="29"/>
+          <w:sz-cs w:val="29"/>
+          <w:spacing w:val="0"/>
+          <w:color w:val="181E2A"/>
+        </w:rPr>
+        <w:t xml:space="preserve"> → “Phase 1A”, remainder “Future Phases”; add further phase WKTs to the script's </w:t>
+      </w:r>
+      <w:r>
+        <w:rPr>
+          <w:rFonts w:ascii="Menlo" w:hAnsi="Menlo" w:cs="Menlo"/>
+          <w:sz w:val="25"/>
+          <w:sz-cs w:val="25"/>
+          <w:spacing w:val="0"/>
+          <w:color w:val="181E2A"/>
+        </w:rPr>
+        <w:t xml:space="preserve">PHASE_EXTENTS</w:t>
+      </w:r>
+      <w:r>
+        <w:rPr>
+          <w:rFonts w:ascii="Helvetica Neue" w:hAnsi="Helvetica Neue" w:cs="Helvetica Neue"/>
+          <w:sz w:val="29"/>
+          <w:sz-cs w:val="29"/>
+          <w:spacing w:val="0"/>
+          <w:color w:val="181E2A"/>
+        </w:rPr>
+        <w:t xml:space="preserve"> list as boundaries become available — no code change elsewhere). The extractor's </w:t>
+      </w:r>
+      <w:r>
+        <w:rPr>
+          <w:rFonts w:ascii="Menlo" w:hAnsi="Menlo" w:cs="Menlo"/>
+          <w:sz w:val="25"/>
+          <w:sz-cs w:val="25"/>
+          <w:spacing w:val="0"/>
+          <w:color w:val="181E2A"/>
+        </w:rPr>
+        <w:t xml:space="preserve">--extent-wkt</w:t>
+      </w:r>
+      <w:r>
+        <w:rPr>
+          <w:rFonts w:ascii="Helvetica Neue" w:hAnsi="Helvetica Neue" w:cs="Helvetica Neue"/>
+          <w:sz w:val="29"/>
+          <w:sz-cs w:val="29"/>
+          <w:spacing w:val="0"/>
+          <w:color w:val="181E2A"/>
+        </w:rPr>
+        <w:t xml:space="preserve"> / </w:t>
       </w:r>
       <w:r>
         <w:rPr>
@@ -6428,7 +6522,7 @@
           <w:spacing w:val="0"/>
           <w:color w:val="181E2A"/>
         </w:rPr>
-        <w:t xml:space="preserve"> centroid cut-off remains as a fallback.)</w:t>
+        <w:t xml:space="preserve"> options remain for extracting a single phase in isolation.</w:t>
       </w:r>
     </w:p>
     <w:p>
@@ -6951,7 +7045,7 @@
           <w:spacing w:val="0"/>
           <w:color w:val="181E2A"/>
         </w:rPr>
-        <w:t xml:space="preserve">Within Phase 1A extent polygon</w:t>
+        <w:t xml:space="preserve">≥ 0.1 ha (sliver filter)</w:t>
       </w:r>
     </w:p>
     <w:p>
@@ -6966,20 +7060,41 @@
           <w:spacing w:val="0"/>
           <w:color w:val="181E2A"/>
         </w:rPr>
-        <w:t xml:space="preserve">119</w:t>
-      </w:r>
-    </w:p>
-    <w:p>
-      <w:pPr/>
-      <w:r>
-        <w:rPr>
-          <w:rFonts w:ascii="Helvetica Neue" w:hAnsi="Helvetica Neue" w:cs="Helvetica Neue"/>
-          <w:sz w:val="26"/>
-          <w:sz-cs w:val="26"/>
-          <w:spacing w:val="0"/>
-          <w:color w:val="181E2A"/>
-        </w:rPr>
-        <w:t xml:space="preserve">≥ 0.1 ha (sliver filter)</w:t>
+        <w:t xml:space="preserve">137</w:t>
+      </w:r>
+    </w:p>
+    <w:p>
+      <w:pPr/>
+      <w:r>
+        <w:rPr>
+          <w:rFonts w:ascii="Helvetica Neue" w:hAnsi="Helvetica Neue" w:cs="Helvetica Neue"/>
+          <w:sz w:val="26"/>
+          <w:sz-cs w:val="26"/>
+          <w:spacing w:val="0"/>
+          <w:color w:val="181E2A"/>
+        </w:rPr>
+        <w:t xml:space="preserve">After deduplication — </w:t>
+      </w:r>
+      <w:r>
+        <w:rPr>
+          <w:rFonts w:ascii="Helvetica Neue" w:hAnsi="Helvetica Neue" w:cs="Helvetica Neue"/>
+          <w:sz w:val="26"/>
+          <w:sz-cs w:val="26"/>
+          <w:b/>
+          <w:spacing w:val="0"/>
+          <w:color w:val="181E2A"/>
+        </w:rPr>
+        <w:t xml:space="preserve">seeded parcels (complete zone)</w:t>
+      </w:r>
+      <w:r>
+        <w:rPr>
+          <w:rFonts w:ascii="Helvetica Neue" w:hAnsi="Helvetica Neue" w:cs="Helvetica Neue"/>
+          <w:sz w:val="26"/>
+          <w:sz-cs w:val="26"/>
+          <w:spacing w:val="0"/>
+          <w:color w:val="181E2A"/>
+        </w:rPr>
+        <w:t xml:space="preserve"/>
       </w:r>
     </w:p>
     <w:p>
@@ -6991,44 +7106,34 @@
           <w:rFonts w:ascii="Helvetica Neue" w:hAnsi="Helvetica Neue" w:cs="Helvetica Neue"/>
           <w:sz w:val="26"/>
           <w:sz-cs w:val="26"/>
-          <w:spacing w:val="0"/>
-          <w:color w:val="181E2A"/>
-        </w:rPr>
-        <w:t xml:space="preserve">66</w:t>
-      </w:r>
-    </w:p>
-    <w:p>
-      <w:pPr/>
-      <w:r>
-        <w:rPr>
-          <w:rFonts w:ascii="Helvetica Neue" w:hAnsi="Helvetica Neue" w:cs="Helvetica Neue"/>
-          <w:sz w:val="26"/>
-          <w:sz-cs w:val="26"/>
-          <w:spacing w:val="0"/>
-          <w:color w:val="181E2A"/>
-        </w:rPr>
-        <w:t xml:space="preserve">After deduplication — </w:t>
-      </w:r>
-      <w:r>
-        <w:rPr>
-          <w:rFonts w:ascii="Helvetica Neue" w:hAnsi="Helvetica Neue" w:cs="Helvetica Neue"/>
-          <w:sz w:val="26"/>
-          <w:sz-cs w:val="26"/>
-          <w:b/>
-          <w:spacing w:val="0"/>
-          <w:color w:val="181E2A"/>
-        </w:rPr>
-        <w:t xml:space="preserve">seeded parcels</w:t>
-      </w:r>
-      <w:r>
-        <w:rPr>
-          <w:rFonts w:ascii="Helvetica Neue" w:hAnsi="Helvetica Neue" w:cs="Helvetica Neue"/>
-          <w:sz w:val="26"/>
-          <w:sz-cs w:val="26"/>
-          <w:spacing w:val="0"/>
-          <w:color w:val="181E2A"/>
-        </w:rPr>
-        <w:t xml:space="preserve"/>
+          <w:b/>
+          <w:spacing w:val="0"/>
+          <w:color w:val="181E2A"/>
+        </w:rPr>
+        <w:t xml:space="preserve">124</w:t>
+      </w:r>
+      <w:r>
+        <w:rPr>
+          <w:rFonts w:ascii="Helvetica Neue" w:hAnsi="Helvetica Neue" w:cs="Helvetica Neue"/>
+          <w:sz w:val="26"/>
+          <w:sz-cs w:val="26"/>
+          <w:spacing w:val="0"/>
+          <w:color w:val="181E2A"/>
+        </w:rPr>
+        <w:t xml:space="preserve"/>
+      </w:r>
+    </w:p>
+    <w:p>
+      <w:pPr/>
+      <w:r>
+        <w:rPr>
+          <w:rFonts w:ascii="Helvetica Neue" w:hAnsi="Helvetica Neue" w:cs="Helvetica Neue"/>
+          <w:sz w:val="26"/>
+          <w:sz-cs w:val="26"/>
+          <w:spacing w:val="0"/>
+          <w:color w:val="181E2A"/>
+        </w:rPr>
+        <w:t xml:space="preserve">— tagged Phase 1A</w:t>
       </w:r>
     </w:p>
     <w:p>
@@ -7040,21 +7145,122 @@
           <w:rFonts w:ascii="Helvetica Neue" w:hAnsi="Helvetica Neue" w:cs="Helvetica Neue"/>
           <w:sz w:val="26"/>
           <w:sz-cs w:val="26"/>
-          <w:b/>
           <w:spacing w:val="0"/>
           <w:color w:val="181E2A"/>
         </w:rPr>
         <w:t xml:space="preserve">55</w:t>
       </w:r>
-      <w:r>
-        <w:rPr>
-          <w:rFonts w:ascii="Helvetica Neue" w:hAnsi="Helvetica Neue" w:cs="Helvetica Neue"/>
-          <w:sz w:val="26"/>
-          <w:sz-cs w:val="26"/>
-          <w:spacing w:val="0"/>
-          <w:color w:val="181E2A"/>
-        </w:rPr>
-        <w:t xml:space="preserve"/>
+    </w:p>
+    <w:p>
+      <w:pPr/>
+      <w:r>
+        <w:rPr>
+          <w:rFonts w:ascii="Helvetica Neue" w:hAnsi="Helvetica Neue" w:cs="Helvetica Neue"/>
+          <w:sz w:val="26"/>
+          <w:sz-cs w:val="26"/>
+          <w:spacing w:val="0"/>
+          <w:color w:val="181E2A"/>
+        </w:rPr>
+        <w:t xml:space="preserve">— tagged Future Phases</w:t>
+      </w:r>
+    </w:p>
+    <w:p>
+      <w:pPr>
+        <w:jc w:val="right"/>
+      </w:pPr>
+      <w:r>
+        <w:rPr>
+          <w:rFonts w:ascii="Helvetica Neue" w:hAnsi="Helvetica Neue" w:cs="Helvetica Neue"/>
+          <w:sz w:val="26"/>
+          <w:sz-cs w:val="26"/>
+          <w:spacing w:val="0"/>
+          <w:color w:val="181E2A"/>
+        </w:rPr>
+        <w:t xml:space="preserve">69</w:t>
+      </w:r>
+    </w:p>
+    <w:p>
+      <w:pPr/>
+      <w:r>
+        <w:rPr>
+          <w:rFonts w:ascii="Helvetica Neue" w:hAnsi="Helvetica Neue" w:cs="Helvetica Neue"/>
+          <w:sz w:val="26"/>
+          <w:sz-cs w:val="26"/>
+          <w:spacing w:val="0"/>
+          <w:color w:val="181E2A"/>
+        </w:rPr>
+        <w:t xml:space="preserve">Real drawing codes recovered</w:t>
+      </w:r>
+    </w:p>
+    <w:p>
+      <w:pPr>
+        <w:jc w:val="right"/>
+      </w:pPr>
+      <w:r>
+        <w:rPr>
+          <w:rFonts w:ascii="Helvetica Neue" w:hAnsi="Helvetica Neue" w:cs="Helvetica Neue"/>
+          <w:sz w:val="26"/>
+          <w:sz-cs w:val="26"/>
+          <w:spacing w:val="0"/>
+          <w:color w:val="181E2A"/>
+        </w:rPr>
+        <w:t xml:space="preserve">91</w:t>
+      </w:r>
+    </w:p>
+    <w:p>
+      <w:pPr/>
+      <w:r>
+        <w:rPr>
+          <w:rFonts w:ascii="Helvetica Neue" w:hAnsi="Helvetica Neue" w:cs="Helvetica Neue"/>
+          <w:sz w:val="26"/>
+          <w:sz-cs w:val="26"/>
+          <w:spacing w:val="0"/>
+          <w:color w:val="181E2A"/>
+        </w:rPr>
+        <w:t xml:space="preserve">Land-use classified from code prefix (i/l/u/c/m/cp/t)</w:t>
+      </w:r>
+    </w:p>
+    <w:p>
+      <w:pPr>
+        <w:jc w:val="right"/>
+      </w:pPr>
+      <w:r>
+        <w:rPr>
+          <w:rFonts w:ascii="Helvetica Neue" w:hAnsi="Helvetica Neue" w:cs="Helvetica Neue"/>
+          <w:sz w:val="26"/>
+          <w:sz-cs w:val="26"/>
+          <w:spacing w:val="0"/>
+          <w:color w:val="181E2A"/>
+        </w:rPr>
+        <w:t xml:space="preserve">124</w:t>
+      </w:r>
+    </w:p>
+    <w:p>
+      <w:pPr/>
+      <w:r>
+        <w:rPr>
+          <w:rFonts w:ascii="Helvetica Neue" w:hAnsi="Helvetica Neue" w:cs="Helvetica Neue"/>
+          <w:sz w:val="26"/>
+          <w:sz-cs w:val="26"/>
+          <w:spacing w:val="0"/>
+          <w:color w:val="181E2A"/>
+        </w:rPr>
+        <w:t xml:space="preserve">Locked (infrastructure/utility)</w:t>
+      </w:r>
+    </w:p>
+    <w:p>
+      <w:pPr>
+        <w:jc w:val="right"/>
+      </w:pPr>
+      <w:r>
+        <w:rPr>
+          <w:rFonts w:ascii="Helvetica Neue" w:hAnsi="Helvetica Neue" w:cs="Helvetica Neue"/>
+          <w:sz w:val="26"/>
+          <w:sz-cs w:val="26"/>
+          <w:spacing w:val="0"/>
+          <w:color w:val="181E2A"/>
+        </w:rPr>
+        <w:t xml:space="preserve">8</w:t>
       </w:r>
     </w:p>
     <w:p>
@@ -7069,6 +7275,42 @@
           <w:spacing w:val="0"/>
           <w:color w:val="181E2A"/>
         </w:rPr>
+        <w:t xml:space="preserve">Total seeded area: </w:t>
+      </w:r>
+      <w:r>
+        <w:rPr>
+          <w:rFonts w:ascii="Helvetica Neue" w:hAnsi="Helvetica Neue" w:cs="Helvetica Neue"/>
+          <w:sz w:val="29"/>
+          <w:sz-cs w:val="29"/>
+          <w:b/>
+          <w:spacing w:val="0"/>
+          <w:color w:val="181E2A"/>
+        </w:rPr>
+        <w:t xml:space="preserve">509.9 ha</w:t>
+      </w:r>
+      <w:r>
+        <w:rPr>
+          <w:rFonts w:ascii="Helvetica Neue" w:hAnsi="Helvetica Neue" w:cs="Helvetica Neue"/>
+          <w:sz w:val="29"/>
+          <w:sz-cs w:val="29"/>
+          <w:spacing w:val="0"/>
+          <w:color w:val="181E2A"/>
+        </w:rPr>
+        <w:t xml:space="preserve"> (true metres).</w:t>
+      </w:r>
+    </w:p>
+    <w:p>
+      <w:pPr>
+        <w:spacing w:after="293"/>
+      </w:pPr>
+      <w:r>
+        <w:rPr>
+          <w:rFonts w:ascii="Helvetica Neue" w:hAnsi="Helvetica Neue" w:cs="Helvetica Neue"/>
+          <w:sz w:val="29"/>
+          <w:sz-cs w:val="29"/>
+          <w:spacing w:val="0"/>
+          <w:color w:val="181E2A"/>
+        </w:rPr>
         <w:t xml:space="preserve">Largest parcels (codes/names from the drawing labels; locked = non-selectable):</w:t>
       </w:r>
     </w:p>
@@ -7719,7 +7961,7 @@
           <w:spacing w:val="0"/>
           <w:color w:val="181E2A"/>
         </w:rPr>
-        <w:t xml:space="preserve">32 more labelled + 13 unlabelled (IND-nnn)</w:t>
+        <w:t xml:space="preserve">81 more labelled + 33 unlabelled (IND-nnn)</w:t>
       </w:r>
     </w:p>
     <w:p>
@@ -7734,7 +7976,7 @@
           <w:spacing w:val="0"/>
           <w:color w:val="181E2A"/>
         </w:rPr>
-        <w:t xml:space="preserve">0.66–4.46</w:t>
+        <w:t xml:space="preserve">0.1–4.5</w:t>
       </w:r>
     </w:p>
     <w:p>
@@ -7764,28 +8006,7 @@
           <w:spacing w:val="0"/>
           <w:color w:val="181E2A"/>
         </w:rPr>
-        <w:t xml:space="preserve">Total seeded area: </w:t>
-      </w:r>
-      <w:r>
-        <w:rPr>
-          <w:rFonts w:ascii="Helvetica Neue" w:hAnsi="Helvetica Neue" w:cs="Helvetica Neue"/>
-          <w:sz w:val="29"/>
-          <w:sz-cs w:val="29"/>
-          <w:b/>
-          <w:spacing w:val="0"/>
-          <w:color w:val="181E2A"/>
-        </w:rPr>
-        <w:t xml:space="preserve">219.2 ha</w:t>
-      </w:r>
-      <w:r>
-        <w:rPr>
-          <w:rFonts w:ascii="Helvetica Neue" w:hAnsi="Helvetica Neue" w:cs="Helvetica Neue"/>
-          <w:sz w:val="29"/>
-          <w:sz-cs w:val="29"/>
-          <w:spacing w:val="0"/>
-          <w:color w:val="181E2A"/>
-        </w:rPr>
-        <w:t xml:space="preserve"> (true metres).</w:t>
+        <w:t xml:space="preserve">(See the results table above for zone-wide counts.)</w:t>
       </w:r>
     </w:p>
     <w:p>
@@ -8294,7 +8515,7 @@
           <w:spacing w:val="0"/>
           <w:color w:val="181E2A"/>
         </w:rPr>
-        <w:t xml:space="preserve">dotnet run -- ../../masterplan.dxf --extent-wkt phase1a-extent.wkt</w:t>
+        <w:t xml:space="preserve">dotnet run -- ../../masterplan.dxf --codes none        # complete zone</w:t>
       </w:r>
     </w:p>
     <w:p>
@@ -8320,7 +8541,20 @@
           <w:spacing w:val="0"/>
           <w:color w:val="181E2A"/>
         </w:rPr>
-        <w:t xml:space="preserve">python3 ../extract_plot_labels.py    # real codes/names + true-metre scale (reads the DWG)</w:t>
+        <w:t xml:space="preserve">python3 ../tag_phases.py             # phase tagging from extent WKTs</w:t>
+      </w:r>
+    </w:p>
+    <w:p>
+      <w:pPr/>
+      <w:r>
+        <w:rPr>
+          <w:rFonts w:ascii="Menlo" w:hAnsi="Menlo" w:cs="Menlo"/>
+          <w:sz w:val="25"/>
+          <w:sz-cs w:val="25"/>
+          <w:spacing w:val="0"/>
+          <w:color w:val="181E2A"/>
+        </w:rPr>
+        <w:t xml:space="preserve">python3 ../extract_plot_labels.py    # real codes/names/land-use + true-metre scale (reads the DWG)</w:t>
       </w:r>
     </w:p>
     <w:p>
@@ -8427,17 +8661,17 @@
           <w:spacing w:val="0"/>
           <w:color w:val="181E2A"/>
         </w:rPr>
-        <w:t xml:space="preserve">Extent polygon provenance.</w:t>
-      </w:r>
-      <w:r>
-        <w:rPr>
-          <w:rFonts w:ascii="Helvetica Neue" w:hAnsi="Helvetica Neue" w:cs="Helvetica Neue"/>
-          <w:sz w:val="29"/>
-          <w:sz-cs w:val="29"/>
-          <w:spacing w:val="0"/>
-          <w:color w:val="181E2A"/>
-        </w:rPr>
-        <w:t xml:space="preserve"> </w:t>
+        <w:t xml:space="preserve">Phase boundaries.</w:t>
+      </w:r>
+      <w:r>
+        <w:rPr>
+          <w:rFonts w:ascii="Helvetica Neue" w:hAnsi="Helvetica Neue" w:cs="Helvetica Neue"/>
+          <w:sz w:val="29"/>
+          <w:sz-cs w:val="29"/>
+          <w:spacing w:val="0"/>
+          <w:color w:val="181E2A"/>
+        </w:rPr>
+        <w:t xml:space="preserve"> The DWG contains no official phase-boundary layer. </w:t>
       </w:r>
       <w:r>
         <w:rPr>
@@ -8457,7 +8691,27 @@
           <w:spacing w:val="0"/>
           <w:color w:val="181E2A"/>
         </w:rPr>
-        <w:t xml:space="preserve"> is derived from the verified parcel set (union + 10 m margin), not from an official phase boundary — the DWG does not contain one. It is deterministic and exact for the current drawing; replace the file with the official boundary WKT when the drawing office provides it.</w:t>
+        <w:t xml:space="preserve"> is derived from the verified Phase 1A parcel set; parcels outside it are tagged “Future Phases”. Supply official phase polygons to </w:t>
+      </w:r>
+      <w:r>
+        <w:rPr>
+          <w:rFonts w:ascii="Menlo" w:hAnsi="Menlo" w:cs="Menlo"/>
+          <w:sz w:val="25"/>
+          <w:sz-cs w:val="25"/>
+          <w:spacing w:val="0"/>
+          <w:color w:val="181E2A"/>
+        </w:rPr>
+        <w:t xml:space="preserve">tag_phases.py</w:t>
+      </w:r>
+      <w:r>
+        <w:rPr>
+          <w:rFonts w:ascii="Helvetica Neue" w:hAnsi="Helvetica Neue" w:cs="Helvetica Neue"/>
+          <w:sz w:val="29"/>
+          <w:sz-cs w:val="29"/>
+          <w:spacing w:val="0"/>
+          <w:color w:val="181E2A"/>
+        </w:rPr>
+        <w:t xml:space="preserve"> for finer phase attribution.</w:t>
       </w:r>
     </w:p>
     <w:p>
@@ -8497,7 +8751,7 @@
           <w:spacing w:val="0"/>
           <w:color w:val="181E2A"/>
         </w:rPr>
-        <w:t xml:space="preserve"> Resolved: real drawing codes/names are recovered from the DWG model space by </w:t>
+        <w:t xml:space="preserve"> Real drawing codes/names are recovered from the DWG model space by </w:t>
       </w:r>
       <w:r>
         <w:rPr>
@@ -8517,7 +8771,7 @@
           <w:spacing w:val="0"/>
           <w:color w:val="181E2A"/>
         </w:rPr>
-        <w:t xml:space="preserve"> (42 of 55 parcels). The remaining 13 parcels genuinely carry no ID label in the drawing and keep synthesised </w:t>
+        <w:t xml:space="preserve"> (91 of 124 parcels). The remaining 33 parcels carry no ID label in the drawing and keep synthesised </w:t>
       </w:r>
       <w:r>
         <w:rPr>

</xml_diff>

<commit_message>
Tag phases from real DWG development-phase boundary rings (1A/1B/2 found on layer 0)
</commit_message>
<xml_diff>
--- a/LFZ-Project-Documentation.docx
+++ b/LFZ-Project-Documentation.docx
@@ -6422,107 +6422,68 @@
           <w:spacing w:val="0"/>
           <w:color w:val="181E2A"/>
         </w:rPr>
-        <w:t xml:space="preserve"> (no extent filter): every developable parcel in the drawing is seeded. Phases are then tagged by </w:t>
-      </w:r>
-      <w:r>
-        <w:rPr>
-          <w:rFonts w:ascii="Menlo" w:hAnsi="Menlo" w:cs="Menlo"/>
-          <w:sz w:val="25"/>
-          <w:sz-cs w:val="25"/>
-          <w:spacing w:val="0"/>
-          <w:color w:val="181E2A"/>
-        </w:rPr>
-        <w:t xml:space="preserve">tools/tag_phases.py</w:t>
-      </w:r>
-      <w:r>
-        <w:rPr>
-          <w:rFonts w:ascii="Helvetica Neue" w:hAnsi="Helvetica Neue" w:cs="Helvetica Neue"/>
-          <w:sz w:val="29"/>
-          <w:sz-cs w:val="29"/>
-          <w:spacing w:val="0"/>
-          <w:color w:val="181E2A"/>
-        </w:rPr>
-        <w:t xml:space="preserve"> using extent polygons (currently </w:t>
-      </w:r>
-      <w:r>
-        <w:rPr>
-          <w:rFonts w:ascii="Menlo" w:hAnsi="Menlo" w:cs="Menlo"/>
-          <w:sz w:val="25"/>
-          <w:sz-cs w:val="25"/>
-          <w:spacing w:val="0"/>
-          <w:color w:val="181E2A"/>
-        </w:rPr>
-        <w:t xml:space="preserve">phase1a-extent.wkt</w:t>
-      </w:r>
-      <w:r>
-        <w:rPr>
-          <w:rFonts w:ascii="Helvetica Neue" w:hAnsi="Helvetica Neue" w:cs="Helvetica Neue"/>
-          <w:sz w:val="29"/>
-          <w:sz-cs w:val="29"/>
-          <w:spacing w:val="0"/>
-          <w:color w:val="181E2A"/>
-        </w:rPr>
-        <w:t xml:space="preserve"> → “Phase 1A”, remainder “Future Phases”; add further phase WKTs to the script's </w:t>
-      </w:r>
-      <w:r>
-        <w:rPr>
-          <w:rFonts w:ascii="Menlo" w:hAnsi="Menlo" w:cs="Menlo"/>
-          <w:sz w:val="25"/>
-          <w:sz-cs w:val="25"/>
-          <w:spacing w:val="0"/>
-          <w:color w:val="181E2A"/>
-        </w:rPr>
-        <w:t xml:space="preserve">PHASE_EXTENTS</w:t>
-      </w:r>
-      <w:r>
-        <w:rPr>
-          <w:rFonts w:ascii="Helvetica Neue" w:hAnsi="Helvetica Neue" w:cs="Helvetica Neue"/>
-          <w:sz w:val="29"/>
-          <w:sz-cs w:val="29"/>
-          <w:spacing w:val="0"/>
-          <w:color w:val="181E2A"/>
-        </w:rPr>
-        <w:t xml:space="preserve"> list as boundaries become available — no code change elsewhere). The extractor's </w:t>
-      </w:r>
-      <w:r>
-        <w:rPr>
-          <w:rFonts w:ascii="Menlo" w:hAnsi="Menlo" w:cs="Menlo"/>
-          <w:sz w:val="25"/>
-          <w:sz-cs w:val="25"/>
-          <w:spacing w:val="0"/>
-          <w:color w:val="181E2A"/>
-        </w:rPr>
-        <w:t xml:space="preserve">--extent-wkt</w:t>
-      </w:r>
-      <w:r>
-        <w:rPr>
-          <w:rFonts w:ascii="Helvetica Neue" w:hAnsi="Helvetica Neue" w:cs="Helvetica Neue"/>
-          <w:sz w:val="29"/>
-          <w:sz-cs w:val="29"/>
-          <w:spacing w:val="0"/>
-          <w:color w:val="181E2A"/>
-        </w:rPr>
-        <w:t xml:space="preserve"> / </w:t>
-      </w:r>
-      <w:r>
-        <w:rPr>
-          <w:rFonts w:ascii="Menlo" w:hAnsi="Menlo" w:cs="Menlo"/>
-          <w:sz w:val="25"/>
-          <w:sz-cs w:val="25"/>
-          <w:spacing w:val="0"/>
-          <w:color w:val="181E2A"/>
-        </w:rPr>
-        <w:t xml:space="preserve">--extent-max-x</w:t>
-      </w:r>
-      <w:r>
-        <w:rPr>
-          <w:rFonts w:ascii="Helvetica Neue" w:hAnsi="Helvetica Neue" w:cs="Helvetica Neue"/>
-          <w:sz w:val="29"/>
-          <w:sz-cs w:val="29"/>
-          <w:spacing w:val="0"/>
-          <w:color w:val="181E2A"/>
-        </w:rPr>
-        <w:t xml:space="preserve"> options remain for extracting a single phase in isolation.</w:t>
+        <w:t xml:space="preserve"> (no extent filter): every developable parcel in the drawing is seeded. Phases are tagged from the </w:t>
+      </w:r>
+      <w:r>
+        <w:rPr>
+          <w:rFonts w:ascii="Helvetica Neue" w:hAnsi="Helvetica Neue" w:cs="Helvetica Neue"/>
+          <w:sz w:val="29"/>
+          <w:sz-cs w:val="29"/>
+          <w:b/>
+          <w:spacing w:val="0"/>
+          <w:color w:val="181E2A"/>
+        </w:rPr>
+        <w:t xml:space="preserve">development-phase boundary rings found in the DWG itself</w:t>
+      </w:r>
+      <w:r>
+        <w:rPr>
+          <w:rFonts w:ascii="Helvetica Neue" w:hAnsi="Helvetica Neue" w:cs="Helvetica Neue"/>
+          <w:sz w:val="29"/>
+          <w:sz-cs w:val="29"/>
+          <w:spacing w:val="0"/>
+          <w:color w:val="181E2A"/>
+        </w:rPr>
+        <w:t xml:space="preserve">: the drawing legend declares Phase 1A (278 ha), 1B (113 ha), 2 (122 ha) and 3 (246 ha), and closed rings matching those areas exist in model space on layer “0” (found at 276.4 / 115.9 / 132.0 ha). </w:t>
+      </w:r>
+      <w:r>
+        <w:rPr>
+          <w:rFonts w:ascii="Menlo" w:hAnsi="Menlo" w:cs="Menlo"/>
+          <w:sz w:val="25"/>
+          <w:sz-cs w:val="25"/>
+          <w:spacing w:val="0"/>
+          <w:color w:val="181E2A"/>
+        </w:rPr>
+        <w:t xml:space="preserve">extract_plot_labels.py</w:t>
+      </w:r>
+      <w:r>
+        <w:rPr>
+          <w:rFonts w:ascii="Helvetica Neue" w:hAnsi="Helvetica Neue" w:cs="Helvetica Neue"/>
+          <w:sz w:val="29"/>
+          <w:sz-cs w:val="29"/>
+          <w:spacing w:val="0"/>
+          <w:color w:val="181E2A"/>
+        </w:rPr>
+        <w:t xml:space="preserve"> assigns each parcel the tightest phase ring containing its centroid; Phase 3 has no closed ring in the current drawing, so its parcels are tagged “Phase 3 / Future”. (</w:t>
+      </w:r>
+      <w:r>
+        <w:rPr>
+          <w:rFonts w:ascii="Menlo" w:hAnsi="Menlo" w:cs="Menlo"/>
+          <w:sz w:val="25"/>
+          <w:sz-cs w:val="25"/>
+          <w:spacing w:val="0"/>
+          <w:color w:val="181E2A"/>
+        </w:rPr>
+        <w:t xml:space="preserve">tag_phases.py</w:t>
+      </w:r>
+      <w:r>
+        <w:rPr>
+          <w:rFonts w:ascii="Helvetica Neue" w:hAnsi="Helvetica Neue" w:cs="Helvetica Neue"/>
+          <w:sz w:val="29"/>
+          <w:sz-cs w:val="29"/>
+          <w:spacing w:val="0"/>
+          <w:color w:val="181E2A"/>
+        </w:rPr>
+        <w:t xml:space="preserve"> remains as an extent-WKT fallback for parcels that cannot be ring-matched.)</w:t>
       </w:r>
     </w:p>
     <w:p>
@@ -7133,7 +7094,7 @@
           <w:spacing w:val="0"/>
           <w:color w:val="181E2A"/>
         </w:rPr>
-        <w:t xml:space="preserve">— tagged Phase 1A</w:t>
+        <w:t xml:space="preserve">— Phase 1A</w:t>
       </w:r>
     </w:p>
     <w:p>
@@ -7148,20 +7109,20 @@
           <w:spacing w:val="0"/>
           <w:color w:val="181E2A"/>
         </w:rPr>
-        <w:t xml:space="preserve">55</w:t>
-      </w:r>
-    </w:p>
-    <w:p>
-      <w:pPr/>
-      <w:r>
-        <w:rPr>
-          <w:rFonts w:ascii="Helvetica Neue" w:hAnsi="Helvetica Neue" w:cs="Helvetica Neue"/>
-          <w:sz w:val="26"/>
-          <w:sz-cs w:val="26"/>
-          <w:spacing w:val="0"/>
-          <w:color w:val="181E2A"/>
-        </w:rPr>
-        <w:t xml:space="preserve">— tagged Future Phases</w:t>
+        <w:t xml:space="preserve">50</w:t>
+      </w:r>
+    </w:p>
+    <w:p>
+      <w:pPr/>
+      <w:r>
+        <w:rPr>
+          <w:rFonts w:ascii="Helvetica Neue" w:hAnsi="Helvetica Neue" w:cs="Helvetica Neue"/>
+          <w:sz w:val="26"/>
+          <w:sz-cs w:val="26"/>
+          <w:spacing w:val="0"/>
+          <w:color w:val="181E2A"/>
+        </w:rPr>
+        <w:t xml:space="preserve">— Phase 1B</w:t>
       </w:r>
     </w:p>
     <w:p>
@@ -7176,7 +7137,63 @@
           <w:spacing w:val="0"/>
           <w:color w:val="181E2A"/>
         </w:rPr>
-        <w:t xml:space="preserve">69</w:t>
+        <w:t xml:space="preserve">2</w:t>
+      </w:r>
+    </w:p>
+    <w:p>
+      <w:pPr/>
+      <w:r>
+        <w:rPr>
+          <w:rFonts w:ascii="Helvetica Neue" w:hAnsi="Helvetica Neue" w:cs="Helvetica Neue"/>
+          <w:sz w:val="26"/>
+          <w:sz-cs w:val="26"/>
+          <w:spacing w:val="0"/>
+          <w:color w:val="181E2A"/>
+        </w:rPr>
+        <w:t xml:space="preserve">— Phase 2</w:t>
+      </w:r>
+    </w:p>
+    <w:p>
+      <w:pPr>
+        <w:jc w:val="right"/>
+      </w:pPr>
+      <w:r>
+        <w:rPr>
+          <w:rFonts w:ascii="Helvetica Neue" w:hAnsi="Helvetica Neue" w:cs="Helvetica Neue"/>
+          <w:sz w:val="26"/>
+          <w:sz-cs w:val="26"/>
+          <w:spacing w:val="0"/>
+          <w:color w:val="181E2A"/>
+        </w:rPr>
+        <w:t xml:space="preserve">28</w:t>
+      </w:r>
+    </w:p>
+    <w:p>
+      <w:pPr/>
+      <w:r>
+        <w:rPr>
+          <w:rFonts w:ascii="Helvetica Neue" w:hAnsi="Helvetica Neue" w:cs="Helvetica Neue"/>
+          <w:sz w:val="26"/>
+          <w:sz-cs w:val="26"/>
+          <w:spacing w:val="0"/>
+          <w:color w:val="181E2A"/>
+        </w:rPr>
+        <w:t xml:space="preserve">— Phase 3 / Future</w:t>
+      </w:r>
+    </w:p>
+    <w:p>
+      <w:pPr>
+        <w:jc w:val="right"/>
+      </w:pPr>
+      <w:r>
+        <w:rPr>
+          <w:rFonts w:ascii="Helvetica Neue" w:hAnsi="Helvetica Neue" w:cs="Helvetica Neue"/>
+          <w:sz w:val="26"/>
+          <w:sz-cs w:val="26"/>
+          <w:spacing w:val="0"/>
+          <w:color w:val="181E2A"/>
+        </w:rPr>
+        <w:t xml:space="preserve">44</w:t>
       </w:r>
     </w:p>
     <w:p>
@@ -8661,57 +8678,17 @@
           <w:spacing w:val="0"/>
           <w:color w:val="181E2A"/>
         </w:rPr>
-        <w:t xml:space="preserve">Phase boundaries.</w:t>
-      </w:r>
-      <w:r>
-        <w:rPr>
-          <w:rFonts w:ascii="Helvetica Neue" w:hAnsi="Helvetica Neue" w:cs="Helvetica Neue"/>
-          <w:sz w:val="29"/>
-          <w:sz-cs w:val="29"/>
-          <w:spacing w:val="0"/>
-          <w:color w:val="181E2A"/>
-        </w:rPr>
-        <w:t xml:space="preserve"> The DWG contains no official phase-boundary layer. </w:t>
-      </w:r>
-      <w:r>
-        <w:rPr>
-          <w:rFonts w:ascii="Menlo" w:hAnsi="Menlo" w:cs="Menlo"/>
-          <w:sz w:val="25"/>
-          <w:sz-cs w:val="25"/>
-          <w:spacing w:val="0"/>
-          <w:color w:val="181E2A"/>
-        </w:rPr>
-        <w:t xml:space="preserve">phase1a-extent.wkt</w:t>
-      </w:r>
-      <w:r>
-        <w:rPr>
-          <w:rFonts w:ascii="Helvetica Neue" w:hAnsi="Helvetica Neue" w:cs="Helvetica Neue"/>
-          <w:sz w:val="29"/>
-          <w:sz-cs w:val="29"/>
-          <w:spacing w:val="0"/>
-          <w:color w:val="181E2A"/>
-        </w:rPr>
-        <w:t xml:space="preserve"> is derived from the verified Phase 1A parcel set; parcels outside it are tagged “Future Phases”. Supply official phase polygons to </w:t>
-      </w:r>
-      <w:r>
-        <w:rPr>
-          <w:rFonts w:ascii="Menlo" w:hAnsi="Menlo" w:cs="Menlo"/>
-          <w:sz w:val="25"/>
-          <w:sz-cs w:val="25"/>
-          <w:spacing w:val="0"/>
-          <w:color w:val="181E2A"/>
-        </w:rPr>
-        <w:t xml:space="preserve">tag_phases.py</w:t>
-      </w:r>
-      <w:r>
-        <w:rPr>
-          <w:rFonts w:ascii="Helvetica Neue" w:hAnsi="Helvetica Neue" w:cs="Helvetica Neue"/>
-          <w:sz w:val="29"/>
-          <w:sz-cs w:val="29"/>
-          <w:spacing w:val="0"/>
-          <w:color w:val="181E2A"/>
-        </w:rPr>
-        <w:t xml:space="preserve"> for finer phase attribution.</w:t>
+        <w:t xml:space="preserve">Phase 3 boundary.</w:t>
+      </w:r>
+      <w:r>
+        <w:rPr>
+          <w:rFonts w:ascii="Helvetica Neue" w:hAnsi="Helvetica Neue" w:cs="Helvetica Neue"/>
+          <w:sz w:val="29"/>
+          <w:sz-cs w:val="29"/>
+          <w:spacing w:val="0"/>
+          <w:color w:val="181E2A"/>
+        </w:rPr>
+        <w:t xml:space="preserve"> Phases 1A/1B/2 are tagged from closed boundary rings in the DWG; Phase 3 (246 ha per the legend) exists only as unclosed linework, so its parcels are tagged “Phase 3 / Future”. A closed Phase 3 polygon from the drawing office would complete the attribution.</w:t>
       </w:r>
     </w:p>
     <w:p>

</xml_diff>

<commit_message>
Fix phase attribution: tag from DWG development-phase colour fills (legend swatch ACI mapping), 40/22/29/33
</commit_message>
<xml_diff>
--- a/LFZ-Project-Documentation.docx
+++ b/LFZ-Project-Documentation.docx
@@ -6422,68 +6422,28 @@
           <w:spacing w:val="0"/>
           <w:color w:val="181E2A"/>
         </w:rPr>
-        <w:t xml:space="preserve"> (no extent filter): every developable parcel in the drawing is seeded. Phases are tagged from the </w:t>
-      </w:r>
-      <w:r>
-        <w:rPr>
-          <w:rFonts w:ascii="Helvetica Neue" w:hAnsi="Helvetica Neue" w:cs="Helvetica Neue"/>
-          <w:sz w:val="29"/>
-          <w:sz-cs w:val="29"/>
-          <w:b/>
-          <w:spacing w:val="0"/>
-          <w:color w:val="181E2A"/>
-        </w:rPr>
-        <w:t xml:space="preserve">development-phase boundary rings found in the DWG itself</w:t>
-      </w:r>
-      <w:r>
-        <w:rPr>
-          <w:rFonts w:ascii="Helvetica Neue" w:hAnsi="Helvetica Neue" w:cs="Helvetica Neue"/>
-          <w:sz w:val="29"/>
-          <w:sz-cs w:val="29"/>
-          <w:spacing w:val="0"/>
-          <w:color w:val="181E2A"/>
-        </w:rPr>
-        <w:t xml:space="preserve">: the drawing legend declares Phase 1A (278 ha), 1B (113 ha), 2 (122 ha) and 3 (246 ha), and closed rings matching those areas exist in model space on layer “0” (found at 276.4 / 115.9 / 132.0 ha). </w:t>
-      </w:r>
-      <w:r>
-        <w:rPr>
-          <w:rFonts w:ascii="Menlo" w:hAnsi="Menlo" w:cs="Menlo"/>
-          <w:sz w:val="25"/>
-          <w:sz-cs w:val="25"/>
-          <w:spacing w:val="0"/>
-          <w:color w:val="181E2A"/>
-        </w:rPr>
-        <w:t xml:space="preserve">extract_plot_labels.py</w:t>
-      </w:r>
-      <w:r>
-        <w:rPr>
-          <w:rFonts w:ascii="Helvetica Neue" w:hAnsi="Helvetica Neue" w:cs="Helvetica Neue"/>
-          <w:sz w:val="29"/>
-          <w:sz-cs w:val="29"/>
-          <w:spacing w:val="0"/>
-          <w:color w:val="181E2A"/>
-        </w:rPr>
-        <w:t xml:space="preserve"> assigns each parcel the tightest phase ring containing its centroid; Phase 3 has no closed ring in the current drawing, so its parcels are tagged “Phase 3 / Future”. (</w:t>
-      </w:r>
-      <w:r>
-        <w:rPr>
-          <w:rFonts w:ascii="Menlo" w:hAnsi="Menlo" w:cs="Menlo"/>
-          <w:sz w:val="25"/>
-          <w:sz-cs w:val="25"/>
-          <w:spacing w:val="0"/>
-          <w:color w:val="181E2A"/>
-        </w:rPr>
-        <w:t xml:space="preserve">tag_phases.py</w:t>
-      </w:r>
-      <w:r>
-        <w:rPr>
-          <w:rFonts w:ascii="Helvetica Neue" w:hAnsi="Helvetica Neue" w:cs="Helvetica Neue"/>
-          <w:sz w:val="29"/>
-          <w:sz-cs w:val="29"/>
-          <w:spacing w:val="0"/>
-          <w:color w:val="181E2A"/>
-        </w:rPr>
-        <w:t xml:space="preserve"> remains as an extent-WKT fallback for parcels that cannot be ring-matched.)</w:t>
+        <w:t xml:space="preserve"> (no extent filter): every developable parcel in the drawing is seeded. Phases are tagged from the DWG's own </w:t>
+      </w:r>
+      <w:r>
+        <w:rPr>
+          <w:rFonts w:ascii="Helvetica Neue" w:hAnsi="Helvetica Neue" w:cs="Helvetica Neue"/>
+          <w:sz w:val="29"/>
+          <w:sz-cs w:val="29"/>
+          <w:b/>
+          <w:spacing w:val="0"/>
+          <w:color w:val="181E2A"/>
+        </w:rPr>
+        <w:t xml:space="preserve">development-phase colour fills</w:t>
+      </w:r>
+      <w:r>
+        <w:rPr>
+          <w:rFonts w:ascii="Helvetica Neue" w:hAnsi="Helvetica Neue" w:cs="Helvetica Neue"/>
+          <w:sz w:val="29"/>
+          <w:sz-cs w:val="29"/>
+          <w:spacing w:val="0"/>
+          <w:color w:val="181E2A"/>
+        </w:rPr>
+        <w:t xml:space="preserve">: the plan carries SOLID hatches per phase whose colours are fixed by the legend swatch column (ACI 9 = Phase 1A, 153 = Phase 1B, 50/2 = Phase 2, 11 = Phase 3 — the same grey/blue/yellow/salmon scheme visible in the published PDF). Hatches with embedded boundary paths are used directly (Phase 2: 8.5 + 32.4 + 80.6 ha ≈ legend 122 ha; Phase 3: 37 + 52.6 + 115.9 + 132 ha ≈ legend 246 ha); associative hatches (Phase 1A/1B) are resolved to the phase-scale boundary ring containing their seed point (276.4 ha ≈ legend 278; northern strip 167 ha). Each parcel gets the tightest containing fill.</w:t>
       </w:r>
     </w:p>
     <w:p>
@@ -7109,7 +7069,7 @@
           <w:spacing w:val="0"/>
           <w:color w:val="181E2A"/>
         </w:rPr>
-        <w:t xml:space="preserve">50</w:t>
+        <w:t xml:space="preserve">40</w:t>
       </w:r>
     </w:p>
     <w:p>
@@ -7137,7 +7097,7 @@
           <w:spacing w:val="0"/>
           <w:color w:val="181E2A"/>
         </w:rPr>
-        <w:t xml:space="preserve">2</w:t>
+        <w:t xml:space="preserve">22</w:t>
       </w:r>
     </w:p>
     <w:p>
@@ -7165,20 +7125,20 @@
           <w:spacing w:val="0"/>
           <w:color w:val="181E2A"/>
         </w:rPr>
-        <w:t xml:space="preserve">28</w:t>
-      </w:r>
-    </w:p>
-    <w:p>
-      <w:pPr/>
-      <w:r>
-        <w:rPr>
-          <w:rFonts w:ascii="Helvetica Neue" w:hAnsi="Helvetica Neue" w:cs="Helvetica Neue"/>
-          <w:sz w:val="26"/>
-          <w:sz-cs w:val="26"/>
-          <w:spacing w:val="0"/>
-          <w:color w:val="181E2A"/>
-        </w:rPr>
-        <w:t xml:space="preserve">— Phase 3 / Future</w:t>
+        <w:t xml:space="preserve">29</w:t>
+      </w:r>
+    </w:p>
+    <w:p>
+      <w:pPr/>
+      <w:r>
+        <w:rPr>
+          <w:rFonts w:ascii="Helvetica Neue" w:hAnsi="Helvetica Neue" w:cs="Helvetica Neue"/>
+          <w:sz w:val="26"/>
+          <w:sz-cs w:val="26"/>
+          <w:spacing w:val="0"/>
+          <w:color w:val="181E2A"/>
+        </w:rPr>
+        <w:t xml:space="preserve">— Phase 3</w:t>
       </w:r>
     </w:p>
     <w:p>
@@ -7193,7 +7153,7 @@
           <w:spacing w:val="0"/>
           <w:color w:val="181E2A"/>
         </w:rPr>
-        <w:t xml:space="preserve">44</w:t>
+        <w:t xml:space="preserve">33</w:t>
       </w:r>
     </w:p>
     <w:p>
@@ -8678,17 +8638,17 @@
           <w:spacing w:val="0"/>
           <w:color w:val="181E2A"/>
         </w:rPr>
-        <w:t xml:space="preserve">Phase 3 boundary.</w:t>
-      </w:r>
-      <w:r>
-        <w:rPr>
-          <w:rFonts w:ascii="Helvetica Neue" w:hAnsi="Helvetica Neue" w:cs="Helvetica Neue"/>
-          <w:sz w:val="29"/>
-          <w:sz-cs w:val="29"/>
-          <w:spacing w:val="0"/>
-          <w:color w:val="181E2A"/>
-        </w:rPr>
-        <w:t xml:space="preserve"> Phases 1A/1B/2 are tagged from closed boundary rings in the DWG; Phase 3 (246 ha per the legend) exists only as unclosed linework, so its parcels are tagged “Phase 3 / Future”. A closed Phase 3 polygon from the drawing office would complete the attribution.</w:t>
+        <w:t xml:space="preserve">Phase gross vs parcel areas.</w:t>
+      </w:r>
+      <w:r>
+        <w:rPr>
+          <w:rFonts w:ascii="Helvetica Neue" w:hAnsi="Helvetica Neue" w:cs="Helvetica Neue"/>
+          <w:sz w:val="29"/>
+          <w:sz-cs w:val="29"/>
+          <w:spacing w:val="0"/>
+          <w:color w:val="181E2A"/>
+        </w:rPr>
+        <w:t xml:space="preserve"> Legend figures are gross phase areas (including roads/water); the seeded parcel-area sums per phase are lower (1A 134 ha, 1B 85 ha, 2 129 ha, 3 159 ha). Parcels straddling a fill edge are attributed by centroid — verify edge cases against the published PDF.</w:t>
       </w:r>
     </w:p>
     <w:p>

</xml_diff>